<commit_message>
refactor(docs): upgrade OrderPayment ER docs
</commit_message>
<xml_diff>
--- a/docs/architecture/OrderPayment ER-scheme.docx
+++ b/docs/architecture/OrderPayment ER-scheme.docx
@@ -1,6 +1,6 @@
 
 <file path=word/document.xml><?xml version="1.0" encoding="utf-8"?>
-<w:document xmlns:wpc="http://schemas.microsoft.com/office/word/2010/wordprocessingCanvas" xmlns:cx="http://schemas.microsoft.com/office/drawing/2014/chartex" xmlns:cx1="http://schemas.microsoft.com/office/drawing/2015/9/8/chartex" xmlns:cx2="http://schemas.microsoft.com/office/drawing/2015/10/21/chartex" xmlns:cx3="http://schemas.microsoft.com/office/drawing/2016/5/9/chartex" xmlns:cx4="http://schemas.microsoft.com/office/drawing/2016/5/10/chartex" xmlns:cx5="http://schemas.microsoft.com/office/drawing/2016/5/11/chartex" xmlns:cx6="http://schemas.microsoft.com/office/drawing/2016/5/12/chartex" xmlns:cx7="http://schemas.microsoft.com/office/drawing/2016/5/13/chartex" xmlns:cx8="http://schemas.microsoft.com/office/drawing/2016/5/14/chartex" xmlns:mc="http://schemas.openxmlformats.org/markup-compatibility/2006" xmlns:aink="http://schemas.microsoft.com/office/drawing/2016/ink" xmlns:am3d="http://schemas.microsoft.com/office/drawing/2017/model3d" xmlns:o="urn:schemas-microsoft-com:office:office" xmlns:oel="http://schemas.microsoft.com/office/2019/extlst" xmlns:r="http://schemas.openxmlformats.org/officeDocument/2006/relationships" xmlns:m="http://schemas.openxmlformats.org/officeDocument/2006/math" xmlns:v="urn:schemas-microsoft-com:vml" xmlns:wp14="http://schemas.microsoft.com/office/word/2010/wordprocessingDrawing" xmlns:wp="http://schemas.openxmlformats.org/drawingml/2006/wordprocessingDrawing" xmlns:w10="urn:schemas-microsoft-com:office:word" xmlns:w="http://schemas.openxmlformats.org/wordprocessingml/2006/main" xmlns:w14="http://schemas.microsoft.com/office/word/2010/wordml" xmlns:w15="http://schemas.microsoft.com/office/word/2012/wordml" xmlns:w16cex="http://schemas.microsoft.com/office/word/2018/wordml/cex" xmlns:w16cid="http://schemas.microsoft.com/office/word/2016/wordml/cid" xmlns:w16="http://schemas.microsoft.com/office/word/2018/wordml" xmlns:w16du="http://schemas.microsoft.com/office/word/2023/wordml/word16du" xmlns:w16sdtdh="http://schemas.microsoft.com/office/word/2020/wordml/sdtdatahash" xmlns:w16sdtfl="http://schemas.microsoft.com/office/word/2024/wordml/sdtformatlock" xmlns:w16se="http://schemas.microsoft.com/office/word/2015/wordml/symex" xmlns:wpg="http://schemas.microsoft.com/office/word/2010/wordprocessingGroup" xmlns:wpi="http://schemas.microsoft.com/office/word/2010/wordprocessingInk" xmlns:wne="http://schemas.microsoft.com/office/word/2006/wordml" xmlns:wps="http://schemas.microsoft.com/office/word/2010/wordprocessingShape" mc:Ignorable="w14 w15 w16se w16cid w16 w16cex w16sdtdh w16sdtfl w16du wp14">
+<w:document xmlns:wpc="http://schemas.microsoft.com/office/word/2010/wordprocessingCanvas" xmlns:cx="http://schemas.microsoft.com/office/drawing/2014/chartex" xmlns:cx1="http://schemas.microsoft.com/office/drawing/2015/9/8/chartex" xmlns:cx2="http://schemas.microsoft.com/office/drawing/2015/10/21/chartex" xmlns:cx3="http://schemas.microsoft.com/office/drawing/2016/5/9/chartex" xmlns:cx4="http://schemas.microsoft.com/office/drawing/2016/5/10/chartex" xmlns:cx5="http://schemas.microsoft.com/office/drawing/2016/5/11/chartex" xmlns:cx6="http://schemas.microsoft.com/office/drawing/2016/5/12/chartex" xmlns:cx7="http://schemas.microsoft.com/office/drawing/2016/5/13/chartex" xmlns:cx8="http://schemas.microsoft.com/office/drawing/2016/5/14/chartex" xmlns:mc="http://schemas.openxmlformats.org/markup-compatibility/2006" xmlns:aink="http://schemas.microsoft.com/office/drawing/2016/ink" xmlns:am3d="http://schemas.microsoft.com/office/drawing/2017/model3d" xmlns:o="urn:schemas-microsoft-com:office:office" xmlns:oel="http://schemas.microsoft.com/office/2019/extlst" xmlns:r="http://schemas.openxmlformats.org/officeDocument/2006/relationships" xmlns:m="http://schemas.openxmlformats.org/officeDocument/2006/math" xmlns:v="urn:schemas-microsoft-com:vml" xmlns:wp14="http://schemas.microsoft.com/office/word/2010/wordprocessingDrawing" xmlns:wp="http://schemas.openxmlformats.org/drawingml/2006/wordprocessingDrawing" xmlns:w10="urn:schemas-microsoft-com:office:word" xmlns:w="http://schemas.openxmlformats.org/wordprocessingml/2006/main" xmlns:w14="http://schemas.microsoft.com/office/word/2010/wordml" xmlns:w15="http://schemas.microsoft.com/office/word/2012/wordml" xmlns:w16cei="http://schemas.microsoft.com/office/word/2026/wordml/cei" xmlns:w16cex="http://schemas.microsoft.com/office/word/2018/wordml/cex" xmlns:w16cid="http://schemas.microsoft.com/office/word/2016/wordml/cid" xmlns:w16="http://schemas.microsoft.com/office/word/2018/wordml" xmlns:w16du="http://schemas.microsoft.com/office/word/2023/wordml/word16du" xmlns:w16sdtdh="http://schemas.microsoft.com/office/word/2020/wordml/sdtdatahash" xmlns:w16sdtfl="http://schemas.microsoft.com/office/word/2024/wordml/sdtformatlock" xmlns:w16se="http://schemas.microsoft.com/office/word/2015/wordml/symex" xmlns:wpg="http://schemas.microsoft.com/office/word/2010/wordprocessingGroup" xmlns:wpi="http://schemas.microsoft.com/office/word/2010/wordprocessingInk" xmlns:wne="http://schemas.microsoft.com/office/word/2006/wordml" xmlns:wps="http://schemas.microsoft.com/office/word/2010/wordprocessingShape" mc:Ignorable="w14 w15 w16se w16cid w16 w16cex w16sdtdh w16sdtfl w16du wp14">
   <w:body>
     <w:p>
       <w:pPr>
@@ -9,19 +9,11 @@
           <w:lang w:val="en-US"/>
         </w:rPr>
       </w:pPr>
-      <w:proofErr w:type="spellStart"/>
       <w:r>
         <w:rPr>
           <w:lang w:val="en-US"/>
         </w:rPr>
-        <w:t>OrderPayment</w:t>
-      </w:r>
-      <w:proofErr w:type="spellEnd"/>
-      <w:r>
-        <w:rPr>
-          <w:lang w:val="en-US"/>
-        </w:rPr>
-        <w:t xml:space="preserve"> ER Scheme</w:t>
+        <w:t>OrderPayment ER Scheme</w:t>
       </w:r>
     </w:p>
     <w:p>
@@ -44,10 +36,10 @@
           <w:noProof/>
         </w:rPr>
         <w:drawing>
-          <wp:inline distT="0" distB="0" distL="0" distR="0" wp14:anchorId="1D6E3038" wp14:editId="18F9C77C">
-            <wp:extent cx="5629275" cy="2592070"/>
-            <wp:effectExtent l="0" t="0" r="9525" b="0"/>
-            <wp:docPr id="428793415" name="Рисунок 1"/>
+          <wp:inline distT="0" distB="0" distL="0" distR="0" wp14:anchorId="69313861" wp14:editId="713CB2BB">
+            <wp:extent cx="5638800" cy="3448050"/>
+            <wp:effectExtent l="0" t="0" r="0" b="0"/>
+            <wp:docPr id="1420888144" name="Рисунок 1"/>
             <wp:cNvGraphicFramePr>
               <a:graphicFrameLocks xmlns:a="http://schemas.openxmlformats.org/drawingml/2006/main" noChangeAspect="1"/>
             </wp:cNvGraphicFramePr>
@@ -76,7 +68,7 @@
                   <pic:spPr bwMode="auto">
                     <a:xfrm>
                       <a:off x="0" y="0"/>
-                      <a:ext cx="5629275" cy="2592070"/>
+                      <a:ext cx="5638800" cy="3448050"/>
                     </a:xfrm>
                     <a:prstGeom prst="rect">
                       <a:avLst/>
@@ -135,14 +127,12 @@
         </w:rPr>
         <w:t xml:space="preserve"> </w:t>
       </w:r>
-      <w:proofErr w:type="spellStart"/>
       <w:r>
         <w:rPr>
           <w:lang w:val="en-US"/>
         </w:rPr>
         <w:t>OrderPayment</w:t>
       </w:r>
-      <w:proofErr w:type="spellEnd"/>
     </w:p>
     <w:p>
       <w:pPr>
@@ -168,14 +158,12 @@
       <w:pPr>
         <w:pStyle w:val="a7"/>
       </w:pPr>
-      <w:proofErr w:type="spellStart"/>
       <w:r>
         <w:rPr>
           <w:lang w:val="en-US"/>
         </w:rPr>
         <w:t>OrderPayments</w:t>
       </w:r>
-      <w:proofErr w:type="spellEnd"/>
       <w:r>
         <w:rPr>
           <w:lang w:val="en-US"/>
@@ -186,21 +174,7 @@
         <w:rPr>
           <w:lang w:val="en-US"/>
         </w:rPr>
-        <w:t xml:space="preserve">: </w:t>
-      </w:r>
-      <w:proofErr w:type="spellStart"/>
-      <w:r>
-        <w:rPr>
-          <w:lang w:val="en-US"/>
-        </w:rPr>
-        <w:t>ExternalSessions</w:t>
-      </w:r>
-      <w:proofErr w:type="spellEnd"/>
-      <w:r>
-        <w:rPr>
-          <w:lang w:val="en-US"/>
-        </w:rPr>
-        <w:t xml:space="preserve"> – </w:t>
+        <w:t xml:space="preserve">: ExternalSessions – </w:t>
       </w:r>
       <w:r>
         <w:rPr>
@@ -383,7 +357,7 @@
     <w:tbl>
       <w:tblPr>
         <w:tblStyle w:val="af4"/>
-        <w:tblW w:w="0" w:type="auto"/>
+        <w:tblW w:w="9484" w:type="dxa"/>
         <w:tblCellMar>
           <w:top w:w="113" w:type="dxa"/>
           <w:bottom w:w="113" w:type="dxa"/>
@@ -391,11 +365,11 @@
         <w:tblLook w:val="04A0" w:firstRow="1" w:lastRow="0" w:firstColumn="1" w:lastColumn="0" w:noHBand="0" w:noVBand="1"/>
       </w:tblPr>
       <w:tblGrid>
-        <w:gridCol w:w="1562"/>
-        <w:gridCol w:w="1405"/>
-        <w:gridCol w:w="2982"/>
-        <w:gridCol w:w="1698"/>
-        <w:gridCol w:w="1698"/>
+        <w:gridCol w:w="1915"/>
+        <w:gridCol w:w="1417"/>
+        <w:gridCol w:w="1840"/>
+        <w:gridCol w:w="1498"/>
+        <w:gridCol w:w="3017"/>
       </w:tblGrid>
       <w:tr>
         <w:trPr>
@@ -403,7 +377,7 @@
         </w:trPr>
         <w:tc>
           <w:tcPr>
-            <w:tcW w:w="1562" w:type="dxa"/>
+            <w:tcW w:w="1880" w:type="dxa"/>
             <w:vMerge w:val="restart"/>
             <w:vAlign w:val="center"/>
           </w:tcPr>
@@ -430,7 +404,7 @@
         </w:tc>
         <w:tc>
           <w:tcPr>
-            <w:tcW w:w="1405" w:type="dxa"/>
+            <w:tcW w:w="1393" w:type="dxa"/>
             <w:vMerge w:val="restart"/>
             <w:vAlign w:val="center"/>
           </w:tcPr>
@@ -457,7 +431,7 @@
         </w:tc>
         <w:tc>
           <w:tcPr>
-            <w:tcW w:w="2982" w:type="dxa"/>
+            <w:tcW w:w="1640" w:type="dxa"/>
             <w:vMerge w:val="restart"/>
             <w:vAlign w:val="center"/>
           </w:tcPr>
@@ -484,7 +458,7 @@
         </w:tc>
         <w:tc>
           <w:tcPr>
-            <w:tcW w:w="3396" w:type="dxa"/>
+            <w:tcW w:w="4571" w:type="dxa"/>
             <w:gridSpan w:val="2"/>
             <w:vAlign w:val="center"/>
           </w:tcPr>
@@ -524,7 +498,7 @@
         </w:trPr>
         <w:tc>
           <w:tcPr>
-            <w:tcW w:w="1562" w:type="dxa"/>
+            <w:tcW w:w="1880" w:type="dxa"/>
             <w:vMerge/>
             <w:vAlign w:val="center"/>
           </w:tcPr>
@@ -543,7 +517,7 @@
         </w:tc>
         <w:tc>
           <w:tcPr>
-            <w:tcW w:w="1405" w:type="dxa"/>
+            <w:tcW w:w="1393" w:type="dxa"/>
             <w:vMerge/>
             <w:vAlign w:val="center"/>
           </w:tcPr>
@@ -562,7 +536,7 @@
         </w:tc>
         <w:tc>
           <w:tcPr>
-            <w:tcW w:w="2982" w:type="dxa"/>
+            <w:tcW w:w="1640" w:type="dxa"/>
             <w:vMerge/>
             <w:vAlign w:val="center"/>
           </w:tcPr>
@@ -581,7 +555,7 @@
         </w:tc>
         <w:tc>
           <w:tcPr>
-            <w:tcW w:w="1698" w:type="dxa"/>
+            <w:tcW w:w="1603" w:type="dxa"/>
             <w:vAlign w:val="center"/>
           </w:tcPr>
           <w:p>
@@ -607,7 +581,7 @@
         </w:tc>
         <w:tc>
           <w:tcPr>
-            <w:tcW w:w="1698" w:type="dxa"/>
+            <w:tcW w:w="2960" w:type="dxa"/>
             <w:vAlign w:val="center"/>
           </w:tcPr>
           <w:p>
@@ -635,7 +609,7 @@
       <w:tr>
         <w:tc>
           <w:tcPr>
-            <w:tcW w:w="1562" w:type="dxa"/>
+            <w:tcW w:w="1880" w:type="dxa"/>
             <w:vAlign w:val="center"/>
           </w:tcPr>
           <w:p>
@@ -659,20 +633,19 @@
         </w:tc>
         <w:tc>
           <w:tcPr>
-            <w:tcW w:w="1405" w:type="dxa"/>
-            <w:vAlign w:val="center"/>
-          </w:tcPr>
-          <w:p>
-            <w:pPr>
-              <w:pStyle w:val="a7"/>
-              <w:ind w:firstLine="0"/>
-              <w:jc w:val="center"/>
-              <w:rPr>
-                <w:rFonts w:ascii="Agency FB" w:hAnsi="Agency FB"/>
-                <w:lang w:val="en-US"/>
-              </w:rPr>
-            </w:pPr>
-            <w:proofErr w:type="spellStart"/>
+            <w:tcW w:w="1393" w:type="dxa"/>
+            <w:vAlign w:val="center"/>
+          </w:tcPr>
+          <w:p>
+            <w:pPr>
+              <w:pStyle w:val="a7"/>
+              <w:ind w:firstLine="0"/>
+              <w:jc w:val="center"/>
+              <w:rPr>
+                <w:rFonts w:ascii="Agency FB" w:hAnsi="Agency FB"/>
+                <w:lang w:val="en-US"/>
+              </w:rPr>
+            </w:pPr>
             <w:r>
               <w:rPr>
                 <w:rFonts w:ascii="Agency FB" w:hAnsi="Agency FB"/>
@@ -687,12 +660,11 @@
               </w:rPr>
               <w:t>uid</w:t>
             </w:r>
-            <w:proofErr w:type="spellEnd"/>
-          </w:p>
-        </w:tc>
-        <w:tc>
-          <w:tcPr>
-            <w:tcW w:w="2982" w:type="dxa"/>
+          </w:p>
+        </w:tc>
+        <w:tc>
+          <w:tcPr>
+            <w:tcW w:w="1640" w:type="dxa"/>
             <w:vAlign w:val="center"/>
           </w:tcPr>
           <w:p>
@@ -716,20 +688,19 @@
         </w:tc>
         <w:tc>
           <w:tcPr>
-            <w:tcW w:w="1698" w:type="dxa"/>
-            <w:vAlign w:val="center"/>
-          </w:tcPr>
-          <w:p>
-            <w:pPr>
-              <w:pStyle w:val="a7"/>
-              <w:ind w:firstLine="0"/>
-              <w:jc w:val="center"/>
-              <w:rPr>
-                <w:rFonts w:ascii="Agency FB" w:hAnsi="Agency FB"/>
-                <w:lang w:val="en-US"/>
-              </w:rPr>
-            </w:pPr>
-            <w:proofErr w:type="spellStart"/>
+            <w:tcW w:w="1603" w:type="dxa"/>
+            <w:vAlign w:val="center"/>
+          </w:tcPr>
+          <w:p>
+            <w:pPr>
+              <w:pStyle w:val="a7"/>
+              <w:ind w:firstLine="0"/>
+              <w:jc w:val="center"/>
+              <w:rPr>
+                <w:rFonts w:ascii="Agency FB" w:hAnsi="Agency FB"/>
+                <w:lang w:val="en-US"/>
+              </w:rPr>
+            </w:pPr>
             <w:r>
               <w:rPr>
                 <w:rFonts w:ascii="Agency FB" w:hAnsi="Agency FB"/>
@@ -737,12 +708,11 @@
               </w:rPr>
               <w:t>OrderPayment</w:t>
             </w:r>
-            <w:proofErr w:type="spellEnd"/>
-          </w:p>
-        </w:tc>
-        <w:tc>
-          <w:tcPr>
-            <w:tcW w:w="1698" w:type="dxa"/>
+          </w:p>
+        </w:tc>
+        <w:tc>
+          <w:tcPr>
+            <w:tcW w:w="2960" w:type="dxa"/>
             <w:vAlign w:val="center"/>
           </w:tcPr>
           <w:p>
@@ -768,21 +738,20 @@
       <w:tr>
         <w:tc>
           <w:tcPr>
-            <w:tcW w:w="1562" w:type="dxa"/>
-            <w:vAlign w:val="center"/>
-          </w:tcPr>
-          <w:p>
-            <w:pPr>
-              <w:pStyle w:val="a7"/>
-              <w:spacing w:line="240" w:lineRule="auto"/>
-              <w:ind w:firstLine="0"/>
-              <w:jc w:val="center"/>
-              <w:rPr>
-                <w:rFonts w:ascii="Agency FB" w:hAnsi="Agency FB"/>
-                <w:lang w:val="en-US"/>
-              </w:rPr>
-            </w:pPr>
-            <w:proofErr w:type="spellStart"/>
+            <w:tcW w:w="1880" w:type="dxa"/>
+            <w:vAlign w:val="center"/>
+          </w:tcPr>
+          <w:p>
+            <w:pPr>
+              <w:pStyle w:val="a7"/>
+              <w:spacing w:line="240" w:lineRule="auto"/>
+              <w:ind w:firstLine="0"/>
+              <w:jc w:val="center"/>
+              <w:rPr>
+                <w:rFonts w:ascii="Agency FB" w:hAnsi="Agency FB"/>
+                <w:lang w:val="en-US"/>
+              </w:rPr>
+            </w:pPr>
             <w:r>
               <w:rPr>
                 <w:rFonts w:ascii="Agency FB" w:hAnsi="Agency FB"/>
@@ -790,102 +759,70 @@
               </w:rPr>
               <w:t>transaction_id</w:t>
             </w:r>
-            <w:proofErr w:type="spellEnd"/>
-          </w:p>
-        </w:tc>
-        <w:tc>
-          <w:tcPr>
-            <w:tcW w:w="1405" w:type="dxa"/>
-            <w:vAlign w:val="center"/>
-          </w:tcPr>
-          <w:p>
-            <w:pPr>
-              <w:pStyle w:val="a7"/>
-              <w:spacing w:line="240" w:lineRule="auto"/>
-              <w:ind w:firstLine="0"/>
-              <w:jc w:val="center"/>
-              <w:rPr>
-                <w:rFonts w:ascii="Agency FB" w:hAnsi="Agency FB"/>
-                <w:lang w:val="en-US"/>
-              </w:rPr>
-            </w:pPr>
-            <w:proofErr w:type="spellStart"/>
-            <w:r>
-              <w:rPr>
-                <w:rFonts w:ascii="Agency FB" w:hAnsi="Agency FB"/>
-              </w:rPr>
-              <w:t>varchar</w:t>
-            </w:r>
-            <w:proofErr w:type="spellEnd"/>
-            <w:r>
-              <w:rPr>
-                <w:rFonts w:ascii="Agency FB" w:hAnsi="Agency FB"/>
-              </w:rPr>
-              <w:t>(255)</w:t>
-            </w:r>
-          </w:p>
-        </w:tc>
-        <w:tc>
-          <w:tcPr>
-            <w:tcW w:w="2982" w:type="dxa"/>
-            <w:vAlign w:val="center"/>
-          </w:tcPr>
-          <w:p>
-            <w:pPr>
-              <w:pStyle w:val="a7"/>
-              <w:spacing w:line="240" w:lineRule="auto"/>
-              <w:ind w:firstLine="0"/>
-              <w:jc w:val="center"/>
-              <w:rPr>
-                <w:rFonts w:ascii="Agency FB" w:hAnsi="Agency FB"/>
-              </w:rPr>
-            </w:pPr>
-            <w:proofErr w:type="spellStart"/>
-            <w:r>
-              <w:rPr>
-                <w:rFonts w:ascii="Agency FB" w:hAnsi="Agency FB"/>
-              </w:rPr>
-              <w:t>Unique</w:t>
-            </w:r>
-            <w:proofErr w:type="spellEnd"/>
-            <w:r>
-              <w:rPr>
-                <w:rFonts w:ascii="Agency FB" w:hAnsi="Agency FB"/>
-              </w:rPr>
-              <w:t xml:space="preserve"> Index (</w:t>
-            </w:r>
-            <w:proofErr w:type="spellStart"/>
-            <w:r>
-              <w:rPr>
-                <w:rFonts w:ascii="Agency FB" w:hAnsi="Agency FB"/>
-              </w:rPr>
-              <w:t>Nullable</w:t>
-            </w:r>
-            <w:proofErr w:type="spellEnd"/>
-            <w:r>
-              <w:rPr>
-                <w:rFonts w:ascii="Agency FB" w:hAnsi="Agency FB"/>
-              </w:rPr>
-              <w:t>)</w:t>
-            </w:r>
-          </w:p>
-        </w:tc>
-        <w:tc>
-          <w:tcPr>
-            <w:tcW w:w="1698" w:type="dxa"/>
-            <w:vAlign w:val="center"/>
-          </w:tcPr>
-          <w:p>
-            <w:pPr>
-              <w:pStyle w:val="a7"/>
-              <w:spacing w:line="240" w:lineRule="auto"/>
-              <w:ind w:firstLine="0"/>
-              <w:jc w:val="center"/>
-              <w:rPr>
-                <w:rFonts w:ascii="Agency FB" w:hAnsi="Agency FB"/>
-              </w:rPr>
-            </w:pPr>
-            <w:proofErr w:type="spellStart"/>
+          </w:p>
+        </w:tc>
+        <w:tc>
+          <w:tcPr>
+            <w:tcW w:w="1393" w:type="dxa"/>
+            <w:vAlign w:val="center"/>
+          </w:tcPr>
+          <w:p>
+            <w:pPr>
+              <w:pStyle w:val="a7"/>
+              <w:spacing w:line="240" w:lineRule="auto"/>
+              <w:ind w:firstLine="0"/>
+              <w:jc w:val="center"/>
+              <w:rPr>
+                <w:rFonts w:ascii="Agency FB" w:hAnsi="Agency FB"/>
+                <w:lang w:val="en-US"/>
+              </w:rPr>
+            </w:pPr>
+            <w:r>
+              <w:rPr>
+                <w:rFonts w:ascii="Agency FB" w:hAnsi="Agency FB"/>
+              </w:rPr>
+              <w:t>varchar(255)</w:t>
+            </w:r>
+          </w:p>
+        </w:tc>
+        <w:tc>
+          <w:tcPr>
+            <w:tcW w:w="1640" w:type="dxa"/>
+            <w:vAlign w:val="center"/>
+          </w:tcPr>
+          <w:p>
+            <w:pPr>
+              <w:pStyle w:val="a7"/>
+              <w:spacing w:line="240" w:lineRule="auto"/>
+              <w:ind w:firstLine="0"/>
+              <w:jc w:val="center"/>
+              <w:rPr>
+                <w:rFonts w:ascii="Agency FB" w:hAnsi="Agency FB"/>
+              </w:rPr>
+            </w:pPr>
+            <w:r>
+              <w:rPr>
+                <w:rFonts w:ascii="Agency FB" w:hAnsi="Agency FB"/>
+              </w:rPr>
+              <w:t>Unique Index (Nullable)</w:t>
+            </w:r>
+          </w:p>
+        </w:tc>
+        <w:tc>
+          <w:tcPr>
+            <w:tcW w:w="1603" w:type="dxa"/>
+            <w:vAlign w:val="center"/>
+          </w:tcPr>
+          <w:p>
+            <w:pPr>
+              <w:pStyle w:val="a7"/>
+              <w:spacing w:line="240" w:lineRule="auto"/>
+              <w:ind w:firstLine="0"/>
+              <w:jc w:val="center"/>
+              <w:rPr>
+                <w:rFonts w:ascii="Agency FB" w:hAnsi="Agency FB"/>
+              </w:rPr>
+            </w:pPr>
             <w:r>
               <w:rPr>
                 <w:rFonts w:ascii="Agency FB" w:hAnsi="Agency FB"/>
@@ -893,53 +830,49 @@
               </w:rPr>
               <w:t>OrderPayment</w:t>
             </w:r>
-            <w:proofErr w:type="spellEnd"/>
-          </w:p>
-        </w:tc>
-        <w:tc>
-          <w:tcPr>
-            <w:tcW w:w="1698" w:type="dxa"/>
-            <w:vAlign w:val="center"/>
-          </w:tcPr>
-          <w:p>
-            <w:pPr>
-              <w:pStyle w:val="a7"/>
-              <w:spacing w:line="240" w:lineRule="auto"/>
-              <w:ind w:firstLine="0"/>
-              <w:jc w:val="center"/>
-              <w:rPr>
-                <w:rFonts w:ascii="Agency FB" w:hAnsi="Agency FB"/>
-              </w:rPr>
-            </w:pPr>
-            <w:proofErr w:type="spellStart"/>
+          </w:p>
+        </w:tc>
+        <w:tc>
+          <w:tcPr>
+            <w:tcW w:w="2960" w:type="dxa"/>
+            <w:vAlign w:val="center"/>
+          </w:tcPr>
+          <w:p>
+            <w:pPr>
+              <w:pStyle w:val="a7"/>
+              <w:spacing w:line="240" w:lineRule="auto"/>
+              <w:ind w:firstLine="0"/>
+              <w:jc w:val="center"/>
+              <w:rPr>
+                <w:rFonts w:ascii="Agency FB" w:hAnsi="Agency FB"/>
+              </w:rPr>
+            </w:pPr>
             <w:r>
               <w:rPr>
                 <w:rFonts w:ascii="Agency FB" w:hAnsi="Agency FB"/>
               </w:rPr>
               <w:t>TransactionId</w:t>
             </w:r>
-            <w:proofErr w:type="spellEnd"/>
           </w:p>
         </w:tc>
       </w:tr>
       <w:tr>
         <w:tc>
           <w:tcPr>
-            <w:tcW w:w="1562" w:type="dxa"/>
-            <w:vAlign w:val="center"/>
-          </w:tcPr>
-          <w:p>
-            <w:pPr>
-              <w:pStyle w:val="a7"/>
-              <w:spacing w:line="240" w:lineRule="auto"/>
-              <w:ind w:firstLine="0"/>
-              <w:jc w:val="center"/>
-              <w:rPr>
-                <w:rFonts w:ascii="Agency FB" w:hAnsi="Agency FB"/>
-                <w:lang w:val="en-US"/>
-              </w:rPr>
-            </w:pPr>
-            <w:proofErr w:type="spellStart"/>
+            <w:tcW w:w="1880" w:type="dxa"/>
+            <w:vAlign w:val="center"/>
+          </w:tcPr>
+          <w:p>
+            <w:pPr>
+              <w:pStyle w:val="a7"/>
+              <w:spacing w:line="240" w:lineRule="auto"/>
+              <w:ind w:firstLine="0"/>
+              <w:jc w:val="center"/>
+              <w:rPr>
+                <w:rFonts w:ascii="Agency FB" w:hAnsi="Agency FB"/>
+                <w:lang w:val="en-US"/>
+              </w:rPr>
+            </w:pPr>
             <w:r>
               <w:rPr>
                 <w:rFonts w:ascii="Agency FB" w:hAnsi="Agency FB"/>
@@ -947,89 +880,69 @@
               </w:rPr>
               <w:t>created_at_utc</w:t>
             </w:r>
-            <w:proofErr w:type="spellEnd"/>
-          </w:p>
-        </w:tc>
-        <w:tc>
-          <w:tcPr>
-            <w:tcW w:w="1405" w:type="dxa"/>
-            <w:vAlign w:val="center"/>
-          </w:tcPr>
-          <w:p>
-            <w:pPr>
-              <w:pStyle w:val="a7"/>
-              <w:spacing w:line="240" w:lineRule="auto"/>
-              <w:ind w:firstLine="0"/>
-              <w:jc w:val="center"/>
-              <w:rPr>
-                <w:rFonts w:ascii="Agency FB" w:hAnsi="Agency FB"/>
-              </w:rPr>
-            </w:pPr>
-            <w:proofErr w:type="spellStart"/>
+          </w:p>
+        </w:tc>
+        <w:tc>
+          <w:tcPr>
+            <w:tcW w:w="1393" w:type="dxa"/>
+            <w:vAlign w:val="center"/>
+          </w:tcPr>
+          <w:p>
+            <w:pPr>
+              <w:pStyle w:val="a7"/>
+              <w:spacing w:line="240" w:lineRule="auto"/>
+              <w:ind w:firstLine="0"/>
+              <w:jc w:val="center"/>
+              <w:rPr>
+                <w:rFonts w:ascii="Agency FB" w:hAnsi="Agency FB"/>
+              </w:rPr>
+            </w:pPr>
             <w:r>
               <w:rPr>
                 <w:rFonts w:ascii="Agency FB" w:hAnsi="Agency FB"/>
               </w:rPr>
               <w:t>timestamptz</w:t>
             </w:r>
-            <w:proofErr w:type="spellEnd"/>
-          </w:p>
-        </w:tc>
-        <w:tc>
-          <w:tcPr>
-            <w:tcW w:w="2982" w:type="dxa"/>
-            <w:vAlign w:val="center"/>
-          </w:tcPr>
-          <w:p>
-            <w:pPr>
-              <w:pStyle w:val="a7"/>
-              <w:spacing w:line="240" w:lineRule="auto"/>
-              <w:ind w:firstLine="0"/>
-              <w:jc w:val="center"/>
-              <w:rPr>
-                <w:rFonts w:ascii="Agency FB" w:hAnsi="Agency FB"/>
-              </w:rPr>
-            </w:pPr>
-            <w:proofErr w:type="spellStart"/>
-            <w:r>
-              <w:rPr>
-                <w:rFonts w:ascii="Agency FB" w:hAnsi="Agency FB"/>
-              </w:rPr>
-              <w:t>Not</w:t>
-            </w:r>
-            <w:proofErr w:type="spellEnd"/>
-            <w:r>
-              <w:rPr>
-                <w:rFonts w:ascii="Agency FB" w:hAnsi="Agency FB"/>
-              </w:rPr>
-              <w:t xml:space="preserve"> </w:t>
-            </w:r>
-            <w:proofErr w:type="spellStart"/>
-            <w:r>
-              <w:rPr>
-                <w:rFonts w:ascii="Agency FB" w:hAnsi="Agency FB"/>
-              </w:rPr>
-              <w:t>Null</w:t>
-            </w:r>
-            <w:proofErr w:type="spellEnd"/>
-          </w:p>
-        </w:tc>
-        <w:tc>
-          <w:tcPr>
-            <w:tcW w:w="1698" w:type="dxa"/>
-            <w:vAlign w:val="center"/>
-          </w:tcPr>
-          <w:p>
-            <w:pPr>
-              <w:pStyle w:val="a7"/>
-              <w:spacing w:line="240" w:lineRule="auto"/>
-              <w:ind w:firstLine="0"/>
-              <w:jc w:val="center"/>
-              <w:rPr>
-                <w:rFonts w:ascii="Agency FB" w:hAnsi="Agency FB"/>
-              </w:rPr>
-            </w:pPr>
-            <w:proofErr w:type="spellStart"/>
+          </w:p>
+        </w:tc>
+        <w:tc>
+          <w:tcPr>
+            <w:tcW w:w="1640" w:type="dxa"/>
+            <w:vAlign w:val="center"/>
+          </w:tcPr>
+          <w:p>
+            <w:pPr>
+              <w:pStyle w:val="a7"/>
+              <w:spacing w:line="240" w:lineRule="auto"/>
+              <w:ind w:firstLine="0"/>
+              <w:jc w:val="center"/>
+              <w:rPr>
+                <w:rFonts w:ascii="Agency FB" w:hAnsi="Agency FB"/>
+              </w:rPr>
+            </w:pPr>
+            <w:r>
+              <w:rPr>
+                <w:rFonts w:ascii="Agency FB" w:hAnsi="Agency FB"/>
+              </w:rPr>
+              <w:t>Not Null</w:t>
+            </w:r>
+          </w:p>
+        </w:tc>
+        <w:tc>
+          <w:tcPr>
+            <w:tcW w:w="1603" w:type="dxa"/>
+            <w:vAlign w:val="center"/>
+          </w:tcPr>
+          <w:p>
+            <w:pPr>
+              <w:pStyle w:val="a7"/>
+              <w:spacing w:line="240" w:lineRule="auto"/>
+              <w:ind w:firstLine="0"/>
+              <w:jc w:val="center"/>
+              <w:rPr>
+                <w:rFonts w:ascii="Agency FB" w:hAnsi="Agency FB"/>
+              </w:rPr>
+            </w:pPr>
             <w:r>
               <w:rPr>
                 <w:rFonts w:ascii="Agency FB" w:hAnsi="Agency FB"/>
@@ -1037,39 +950,36 @@
               </w:rPr>
               <w:t>OrderPayment</w:t>
             </w:r>
-            <w:proofErr w:type="spellEnd"/>
-          </w:p>
-        </w:tc>
-        <w:tc>
-          <w:tcPr>
-            <w:tcW w:w="1698" w:type="dxa"/>
-            <w:vAlign w:val="center"/>
-          </w:tcPr>
-          <w:p>
-            <w:pPr>
-              <w:pStyle w:val="a7"/>
-              <w:spacing w:line="240" w:lineRule="auto"/>
-              <w:ind w:firstLine="0"/>
-              <w:jc w:val="center"/>
-              <w:rPr>
-                <w:rFonts w:ascii="Agency FB" w:hAnsi="Agency FB"/>
-              </w:rPr>
-            </w:pPr>
-            <w:proofErr w:type="spellStart"/>
+          </w:p>
+        </w:tc>
+        <w:tc>
+          <w:tcPr>
+            <w:tcW w:w="2960" w:type="dxa"/>
+            <w:vAlign w:val="center"/>
+          </w:tcPr>
+          <w:p>
+            <w:pPr>
+              <w:pStyle w:val="a7"/>
+              <w:spacing w:line="240" w:lineRule="auto"/>
+              <w:ind w:firstLine="0"/>
+              <w:jc w:val="center"/>
+              <w:rPr>
+                <w:rFonts w:ascii="Agency FB" w:hAnsi="Agency FB"/>
+              </w:rPr>
+            </w:pPr>
             <w:r>
               <w:rPr>
                 <w:rFonts w:ascii="Agency FB" w:hAnsi="Agency FB"/>
               </w:rPr>
               <w:t>CreatedAtUtc</w:t>
             </w:r>
-            <w:proofErr w:type="spellEnd"/>
           </w:p>
         </w:tc>
       </w:tr>
       <w:tr>
         <w:tc>
           <w:tcPr>
-            <w:tcW w:w="1562" w:type="dxa"/>
+            <w:tcW w:w="1880" w:type="dxa"/>
             <w:vAlign w:val="center"/>
           </w:tcPr>
           <w:p>
@@ -1094,7 +1004,7 @@
         </w:tc>
         <w:tc>
           <w:tcPr>
-            <w:tcW w:w="1405" w:type="dxa"/>
+            <w:tcW w:w="1393" w:type="dxa"/>
             <w:vAlign w:val="center"/>
           </w:tcPr>
           <w:p>
@@ -1115,14 +1025,12 @@
               </w:rPr>
               <w:t>v</w:t>
             </w:r>
-            <w:proofErr w:type="spellStart"/>
             <w:r>
               <w:rPr>
                 <w:rFonts w:ascii="Agency FB" w:hAnsi="Agency FB"/>
               </w:rPr>
               <w:t>archar</w:t>
             </w:r>
-            <w:proofErr w:type="spellEnd"/>
             <w:r>
               <w:rPr>
                 <w:rFonts w:ascii="Agency FB" w:hAnsi="Agency FB"/>
@@ -1134,150 +1042,113 @@
         </w:tc>
         <w:tc>
           <w:tcPr>
-            <w:tcW w:w="2982" w:type="dxa"/>
-            <w:vAlign w:val="center"/>
-          </w:tcPr>
-          <w:p>
-            <w:pPr>
-              <w:pStyle w:val="a7"/>
-              <w:spacing w:line="240" w:lineRule="auto"/>
-              <w:ind w:firstLine="0"/>
-              <w:jc w:val="center"/>
-              <w:rPr>
-                <w:rFonts w:ascii="Agency FB" w:hAnsi="Agency FB"/>
-                <w:lang w:val="en-US"/>
-              </w:rPr>
-            </w:pPr>
-            <w:r>
-              <w:rPr>
-                <w:rFonts w:ascii="Agency FB" w:hAnsi="Agency FB"/>
-                <w:lang w:val="en-US"/>
-              </w:rPr>
-              <w:t>Check (</w:t>
-            </w:r>
-            <w:proofErr w:type="spellStart"/>
-            <w:r>
-              <w:rPr>
-                <w:rFonts w:ascii="Agency FB" w:hAnsi="Agency FB"/>
-                <w:lang w:val="en-US"/>
-              </w:rPr>
-              <w:t>enum</w:t>
-            </w:r>
-            <w:proofErr w:type="spellEnd"/>
-            <w:r>
-              <w:rPr>
-                <w:rFonts w:ascii="Agency FB" w:hAnsi="Agency FB"/>
-                <w:lang w:val="en-US"/>
-              </w:rPr>
-              <w:t xml:space="preserve"> </w:t>
-            </w:r>
-            <w:proofErr w:type="spellStart"/>
-            <w:r>
-              <w:rPr>
-                <w:rFonts w:ascii="Agency FB" w:hAnsi="Agency FB"/>
-                <w:lang w:val="en-US"/>
+            <w:tcW w:w="1640" w:type="dxa"/>
+            <w:vAlign w:val="center"/>
+          </w:tcPr>
+          <w:p>
+            <w:pPr>
+              <w:pStyle w:val="a7"/>
+              <w:spacing w:line="240" w:lineRule="auto"/>
+              <w:ind w:firstLine="0"/>
+              <w:jc w:val="center"/>
+              <w:rPr>
+                <w:rFonts w:ascii="Agency FB" w:hAnsi="Agency FB"/>
+                <w:lang w:val="en-US"/>
+              </w:rPr>
+            </w:pPr>
+            <w:r>
+              <w:rPr>
+                <w:rFonts w:ascii="Agency FB" w:hAnsi="Agency FB"/>
+                <w:lang w:val="en-US"/>
+              </w:rPr>
+              <w:t>Check (enum PaymentStatus),</w:t>
+            </w:r>
+          </w:p>
+          <w:p>
+            <w:pPr>
+              <w:pStyle w:val="a7"/>
+              <w:spacing w:line="240" w:lineRule="auto"/>
+              <w:ind w:firstLine="0"/>
+              <w:jc w:val="center"/>
+              <w:rPr>
+                <w:rFonts w:ascii="Agency FB" w:hAnsi="Agency FB" w:cs="Calibri"/>
+                <w:lang w:val="en-US"/>
+              </w:rPr>
+            </w:pPr>
+            <w:r>
+              <w:rPr>
+                <w:rFonts w:ascii="Agency FB" w:hAnsi="Agency FB"/>
+                <w:lang w:val="en-US"/>
+              </w:rPr>
+              <w:t>Not Null</w:t>
+            </w:r>
+          </w:p>
+        </w:tc>
+        <w:tc>
+          <w:tcPr>
+            <w:tcW w:w="1603" w:type="dxa"/>
+            <w:vAlign w:val="center"/>
+          </w:tcPr>
+          <w:p>
+            <w:pPr>
+              <w:pStyle w:val="a7"/>
+              <w:spacing w:line="240" w:lineRule="auto"/>
+              <w:ind w:firstLine="0"/>
+              <w:jc w:val="center"/>
+              <w:rPr>
+                <w:rFonts w:ascii="Agency FB" w:hAnsi="Agency FB"/>
+              </w:rPr>
+            </w:pPr>
+            <w:r>
+              <w:rPr>
+                <w:rFonts w:ascii="Agency FB" w:hAnsi="Agency FB"/>
+                <w:lang w:val="en-US"/>
+              </w:rPr>
+              <w:t>OrderPayment</w:t>
+            </w:r>
+          </w:p>
+        </w:tc>
+        <w:tc>
+          <w:tcPr>
+            <w:tcW w:w="2960" w:type="dxa"/>
+            <w:vAlign w:val="center"/>
+          </w:tcPr>
+          <w:p>
+            <w:pPr>
+              <w:pStyle w:val="a7"/>
+              <w:spacing w:line="240" w:lineRule="auto"/>
+              <w:ind w:firstLine="0"/>
+              <w:jc w:val="center"/>
+              <w:rPr>
+                <w:rFonts w:ascii="Agency FB" w:hAnsi="Agency FB"/>
+              </w:rPr>
+            </w:pPr>
+            <w:r>
+              <w:rPr>
+                <w:rFonts w:ascii="Agency FB" w:hAnsi="Agency FB"/>
               </w:rPr>
               <w:t>PaymentStatus</w:t>
             </w:r>
-            <w:proofErr w:type="spellEnd"/>
-            <w:r>
-              <w:rPr>
-                <w:rFonts w:ascii="Agency FB" w:hAnsi="Agency FB"/>
-                <w:lang w:val="en-US"/>
-              </w:rPr>
-              <w:t>),</w:t>
-            </w:r>
-          </w:p>
-          <w:p>
-            <w:pPr>
-              <w:pStyle w:val="a7"/>
-              <w:spacing w:line="240" w:lineRule="auto"/>
-              <w:ind w:firstLine="0"/>
-              <w:jc w:val="center"/>
-              <w:rPr>
-                <w:rFonts w:ascii="Agency FB" w:hAnsi="Agency FB" w:cs="Calibri"/>
-                <w:lang w:val="en-US"/>
-              </w:rPr>
-            </w:pPr>
-            <w:r>
-              <w:rPr>
-                <w:rFonts w:ascii="Agency FB" w:hAnsi="Agency FB"/>
-                <w:lang w:val="en-US"/>
-              </w:rPr>
-              <w:t>Not Null</w:t>
-            </w:r>
-          </w:p>
-        </w:tc>
-        <w:tc>
-          <w:tcPr>
-            <w:tcW w:w="1698" w:type="dxa"/>
-            <w:vAlign w:val="center"/>
-          </w:tcPr>
-          <w:p>
-            <w:pPr>
-              <w:pStyle w:val="a7"/>
-              <w:spacing w:line="240" w:lineRule="auto"/>
-              <w:ind w:firstLine="0"/>
-              <w:jc w:val="center"/>
-              <w:rPr>
-                <w:rFonts w:ascii="Agency FB" w:hAnsi="Agency FB"/>
-              </w:rPr>
-            </w:pPr>
-            <w:proofErr w:type="spellStart"/>
-            <w:r>
-              <w:rPr>
-                <w:rFonts w:ascii="Agency FB" w:hAnsi="Agency FB"/>
-                <w:lang w:val="en-US"/>
-              </w:rPr>
-              <w:t>OrderPayment</w:t>
-            </w:r>
-            <w:proofErr w:type="spellEnd"/>
-          </w:p>
-        </w:tc>
-        <w:tc>
-          <w:tcPr>
-            <w:tcW w:w="1698" w:type="dxa"/>
-            <w:vAlign w:val="center"/>
-          </w:tcPr>
-          <w:p>
-            <w:pPr>
-              <w:pStyle w:val="a7"/>
-              <w:spacing w:line="240" w:lineRule="auto"/>
-              <w:ind w:firstLine="0"/>
-              <w:jc w:val="center"/>
-              <w:rPr>
-                <w:rFonts w:ascii="Agency FB" w:hAnsi="Agency FB"/>
-              </w:rPr>
-            </w:pPr>
-            <w:proofErr w:type="spellStart"/>
-            <w:r>
-              <w:rPr>
-                <w:rFonts w:ascii="Agency FB" w:hAnsi="Agency FB"/>
-              </w:rPr>
-              <w:t>PaymentStatus</w:t>
-            </w:r>
-            <w:proofErr w:type="spellEnd"/>
           </w:p>
         </w:tc>
       </w:tr>
       <w:tr>
         <w:tc>
           <w:tcPr>
-            <w:tcW w:w="1562" w:type="dxa"/>
-            <w:vAlign w:val="center"/>
-          </w:tcPr>
-          <w:p>
-            <w:pPr>
-              <w:pStyle w:val="a7"/>
-              <w:spacing w:line="240" w:lineRule="auto"/>
-              <w:ind w:firstLine="0"/>
-              <w:jc w:val="center"/>
-              <w:rPr>
-                <w:rFonts w:ascii="Agency FB" w:hAnsi="Agency FB"/>
-                <w:lang w:val="en-US"/>
-              </w:rPr>
-            </w:pPr>
-            <w:proofErr w:type="spellStart"/>
+            <w:tcW w:w="1880" w:type="dxa"/>
+            <w:vAlign w:val="center"/>
+          </w:tcPr>
+          <w:p>
+            <w:pPr>
+              <w:pStyle w:val="a7"/>
+              <w:spacing w:line="240" w:lineRule="auto"/>
+              <w:ind w:firstLine="0"/>
+              <w:jc w:val="center"/>
+              <w:rPr>
+                <w:rFonts w:ascii="Agency FB" w:hAnsi="Agency FB"/>
+                <w:lang w:val="en-US"/>
+              </w:rPr>
+            </w:pPr>
             <w:r>
               <w:rPr>
                 <w:rFonts w:ascii="Agency FB" w:hAnsi="Agency FB"/>
@@ -1285,26 +1156,24 @@
               </w:rPr>
               <w:t>order_id</w:t>
             </w:r>
-            <w:proofErr w:type="spellEnd"/>
-          </w:p>
-        </w:tc>
-        <w:tc>
-          <w:tcPr>
-            <w:tcW w:w="1405" w:type="dxa"/>
-            <w:vAlign w:val="center"/>
-          </w:tcPr>
-          <w:p>
-            <w:pPr>
-              <w:pStyle w:val="a7"/>
-              <w:spacing w:line="240" w:lineRule="auto"/>
-              <w:ind w:firstLine="0"/>
-              <w:jc w:val="center"/>
-              <w:rPr>
-                <w:rFonts w:ascii="Agency FB" w:hAnsi="Agency FB"/>
-                <w:lang w:val="en-US"/>
-              </w:rPr>
-            </w:pPr>
-            <w:proofErr w:type="spellStart"/>
+          </w:p>
+        </w:tc>
+        <w:tc>
+          <w:tcPr>
+            <w:tcW w:w="1393" w:type="dxa"/>
+            <w:vAlign w:val="center"/>
+          </w:tcPr>
+          <w:p>
+            <w:pPr>
+              <w:pStyle w:val="a7"/>
+              <w:spacing w:line="240" w:lineRule="auto"/>
+              <w:ind w:firstLine="0"/>
+              <w:jc w:val="center"/>
+              <w:rPr>
+                <w:rFonts w:ascii="Agency FB" w:hAnsi="Agency FB"/>
+                <w:lang w:val="en-US"/>
+              </w:rPr>
+            </w:pPr>
             <w:r>
               <w:rPr>
                 <w:rFonts w:ascii="Agency FB" w:hAnsi="Agency FB"/>
@@ -1319,12 +1188,11 @@
               </w:rPr>
               <w:t>uid</w:t>
             </w:r>
-            <w:proofErr w:type="spellEnd"/>
-          </w:p>
-        </w:tc>
-        <w:tc>
-          <w:tcPr>
-            <w:tcW w:w="2982" w:type="dxa"/>
+          </w:p>
+        </w:tc>
+        <w:tc>
+          <w:tcPr>
+            <w:tcW w:w="1640" w:type="dxa"/>
             <w:vAlign w:val="center"/>
           </w:tcPr>
           <w:p>
@@ -1368,20 +1236,19 @@
         </w:tc>
         <w:tc>
           <w:tcPr>
-            <w:tcW w:w="1698" w:type="dxa"/>
-            <w:vAlign w:val="center"/>
-          </w:tcPr>
-          <w:p>
-            <w:pPr>
-              <w:pStyle w:val="a7"/>
-              <w:spacing w:line="240" w:lineRule="auto"/>
-              <w:ind w:firstLine="0"/>
-              <w:jc w:val="center"/>
-              <w:rPr>
-                <w:rFonts w:ascii="Agency FB" w:hAnsi="Agency FB"/>
-              </w:rPr>
-            </w:pPr>
-            <w:proofErr w:type="spellStart"/>
+            <w:tcW w:w="1603" w:type="dxa"/>
+            <w:vAlign w:val="center"/>
+          </w:tcPr>
+          <w:p>
+            <w:pPr>
+              <w:pStyle w:val="a7"/>
+              <w:spacing w:line="240" w:lineRule="auto"/>
+              <w:ind w:firstLine="0"/>
+              <w:jc w:val="center"/>
+              <w:rPr>
+                <w:rFonts w:ascii="Agency FB" w:hAnsi="Agency FB"/>
+              </w:rPr>
+            </w:pPr>
             <w:r>
               <w:rPr>
                 <w:rFonts w:ascii="Agency FB" w:hAnsi="Agency FB"/>
@@ -1389,32 +1256,760 @@
               </w:rPr>
               <w:t>OrderPayment</w:t>
             </w:r>
-            <w:proofErr w:type="spellEnd"/>
-          </w:p>
-        </w:tc>
-        <w:tc>
-          <w:tcPr>
-            <w:tcW w:w="1698" w:type="dxa"/>
-            <w:vAlign w:val="center"/>
-          </w:tcPr>
-          <w:p>
-            <w:pPr>
-              <w:pStyle w:val="a7"/>
-              <w:spacing w:line="240" w:lineRule="auto"/>
-              <w:ind w:firstLine="0"/>
-              <w:jc w:val="center"/>
-              <w:rPr>
-                <w:rFonts w:ascii="Agency FB" w:hAnsi="Agency FB"/>
-              </w:rPr>
-            </w:pPr>
-            <w:proofErr w:type="spellStart"/>
+          </w:p>
+        </w:tc>
+        <w:tc>
+          <w:tcPr>
+            <w:tcW w:w="2960" w:type="dxa"/>
+            <w:vAlign w:val="center"/>
+          </w:tcPr>
+          <w:p>
+            <w:pPr>
+              <w:pStyle w:val="a7"/>
+              <w:spacing w:line="240" w:lineRule="auto"/>
+              <w:ind w:firstLine="0"/>
+              <w:jc w:val="center"/>
+              <w:rPr>
+                <w:rFonts w:ascii="Agency FB" w:hAnsi="Agency FB"/>
+              </w:rPr>
+            </w:pPr>
             <w:r>
               <w:rPr>
                 <w:rFonts w:ascii="Agency FB" w:hAnsi="Agency FB"/>
               </w:rPr>
               <w:t>OrderId</w:t>
             </w:r>
-            <w:proofErr w:type="spellEnd"/>
+          </w:p>
+        </w:tc>
+      </w:tr>
+      <w:tr>
+        <w:tc>
+          <w:tcPr>
+            <w:tcW w:w="1880" w:type="dxa"/>
+            <w:vAlign w:val="center"/>
+          </w:tcPr>
+          <w:p>
+            <w:pPr>
+              <w:pStyle w:val="a7"/>
+              <w:spacing w:line="240" w:lineRule="auto"/>
+              <w:ind w:firstLine="0"/>
+              <w:jc w:val="center"/>
+              <w:rPr>
+                <w:rFonts w:ascii="Agency FB" w:hAnsi="Agency FB"/>
+                <w:lang w:val="en-US"/>
+              </w:rPr>
+            </w:pPr>
+            <w:r>
+              <w:rPr>
+                <w:rFonts w:ascii="Agency FB" w:hAnsi="Agency FB"/>
+                <w:lang w:val="en-US"/>
+              </w:rPr>
+              <w:t>e</w:t>
+            </w:r>
+            <w:r>
+              <w:rPr>
+                <w:rFonts w:ascii="Agency FB" w:hAnsi="Agency FB"/>
+                <w:lang w:val="en-US"/>
+              </w:rPr>
+              <w:t>xpected</w:t>
+            </w:r>
+            <w:r>
+              <w:rPr>
+                <w:rFonts w:ascii="Agency FB" w:hAnsi="Agency FB"/>
+                <w:lang w:val="en-US"/>
+              </w:rPr>
+              <w:t>_amount</w:t>
+            </w:r>
+          </w:p>
+        </w:tc>
+        <w:tc>
+          <w:tcPr>
+            <w:tcW w:w="1393" w:type="dxa"/>
+            <w:vAlign w:val="center"/>
+          </w:tcPr>
+          <w:p>
+            <w:pPr>
+              <w:pStyle w:val="a7"/>
+              <w:spacing w:line="240" w:lineRule="auto"/>
+              <w:ind w:firstLine="0"/>
+              <w:jc w:val="center"/>
+              <w:rPr>
+                <w:rFonts w:ascii="Agency FB" w:hAnsi="Agency FB"/>
+                <w:lang w:val="en-US"/>
+              </w:rPr>
+            </w:pPr>
+            <w:r>
+              <w:rPr>
+                <w:rFonts w:ascii="Agency FB" w:hAnsi="Agency FB"/>
+                <w:lang w:val="en-US"/>
+              </w:rPr>
+              <w:t>n</w:t>
+            </w:r>
+            <w:r>
+              <w:rPr>
+                <w:rFonts w:ascii="Agency FB" w:hAnsi="Agency FB"/>
+                <w:lang w:val="en-US"/>
+              </w:rPr>
+              <w:t>umeric(15,2)</w:t>
+            </w:r>
+          </w:p>
+        </w:tc>
+        <w:tc>
+          <w:tcPr>
+            <w:tcW w:w="1640" w:type="dxa"/>
+            <w:vAlign w:val="center"/>
+          </w:tcPr>
+          <w:p>
+            <w:pPr>
+              <w:pStyle w:val="a7"/>
+              <w:spacing w:line="240" w:lineRule="auto"/>
+              <w:ind w:firstLine="0"/>
+              <w:jc w:val="center"/>
+              <w:rPr>
+                <w:rFonts w:ascii="Agency FB" w:hAnsi="Agency FB"/>
+                <w:lang w:val="en-US"/>
+              </w:rPr>
+            </w:pPr>
+            <w:r>
+              <w:rPr>
+                <w:rFonts w:ascii="Agency FB" w:hAnsi="Agency FB"/>
+                <w:lang w:val="en-US"/>
+              </w:rPr>
+              <w:t>C</w:t>
+            </w:r>
+            <w:r>
+              <w:rPr>
+                <w:rFonts w:ascii="Agency FB" w:hAnsi="Agency FB"/>
+                <w:lang w:val="en-US"/>
+              </w:rPr>
+              <w:t>heck</w:t>
+            </w:r>
+            <w:r>
+              <w:rPr>
+                <w:rFonts w:ascii="Agency FB" w:hAnsi="Agency FB"/>
+                <w:lang w:val="en-US"/>
+              </w:rPr>
+              <w:t xml:space="preserve"> (</w:t>
+            </w:r>
+            <w:r>
+              <w:rPr>
+                <w:rFonts w:ascii="Agency FB" w:hAnsi="Agency FB"/>
+                <w:lang w:val="en-US"/>
+              </w:rPr>
+              <w:t>expected_amount</w:t>
+            </w:r>
+            <w:r>
+              <w:rPr>
+                <w:rFonts w:ascii="Agency FB" w:hAnsi="Agency FB"/>
+                <w:lang w:val="en-US"/>
+              </w:rPr>
+              <w:t xml:space="preserve"> &gt;=</w:t>
+            </w:r>
+            <w:r>
+              <w:rPr>
+                <w:rFonts w:ascii="Agency FB" w:hAnsi="Agency FB"/>
+                <w:lang w:val="en-US"/>
+              </w:rPr>
+              <w:t xml:space="preserve"> 0</w:t>
+            </w:r>
+            <w:r>
+              <w:rPr>
+                <w:rFonts w:ascii="Agency FB" w:hAnsi="Agency FB"/>
+                <w:lang w:val="en-US"/>
+              </w:rPr>
+              <w:t>)</w:t>
+            </w:r>
+          </w:p>
+          <w:p>
+            <w:pPr>
+              <w:pStyle w:val="a7"/>
+              <w:spacing w:line="240" w:lineRule="auto"/>
+              <w:ind w:firstLine="0"/>
+              <w:jc w:val="center"/>
+              <w:rPr>
+                <w:rFonts w:ascii="Agency FB" w:hAnsi="Agency FB"/>
+                <w:lang w:val="en-US"/>
+              </w:rPr>
+            </w:pPr>
+            <w:r>
+              <w:rPr>
+                <w:rFonts w:ascii="Agency FB" w:hAnsi="Agency FB"/>
+                <w:lang w:val="en-US"/>
+              </w:rPr>
+              <w:t>Not Null</w:t>
+            </w:r>
+          </w:p>
+        </w:tc>
+        <w:tc>
+          <w:tcPr>
+            <w:tcW w:w="1603" w:type="dxa"/>
+            <w:vAlign w:val="center"/>
+          </w:tcPr>
+          <w:p>
+            <w:pPr>
+              <w:pStyle w:val="a7"/>
+              <w:spacing w:line="240" w:lineRule="auto"/>
+              <w:ind w:firstLine="0"/>
+              <w:jc w:val="center"/>
+              <w:rPr>
+                <w:rFonts w:ascii="Agency FB" w:hAnsi="Agency FB"/>
+                <w:lang w:val="en-US"/>
+              </w:rPr>
+            </w:pPr>
+            <w:r>
+              <w:rPr>
+                <w:rFonts w:ascii="Agency FB" w:hAnsi="Agency FB"/>
+                <w:lang w:val="en-US"/>
+              </w:rPr>
+              <w:t>OrderPayment</w:t>
+            </w:r>
+          </w:p>
+        </w:tc>
+        <w:tc>
+          <w:tcPr>
+            <w:tcW w:w="2960" w:type="dxa"/>
+            <w:vAlign w:val="center"/>
+          </w:tcPr>
+          <w:p>
+            <w:pPr>
+              <w:pStyle w:val="a7"/>
+              <w:spacing w:line="240" w:lineRule="auto"/>
+              <w:ind w:firstLine="0"/>
+              <w:jc w:val="center"/>
+              <w:rPr>
+                <w:rFonts w:ascii="Agency FB" w:hAnsi="Agency FB"/>
+              </w:rPr>
+            </w:pPr>
+            <w:r>
+              <w:rPr>
+                <w:rFonts w:ascii="Agency FB" w:hAnsi="Agency FB"/>
+                <w:lang w:val="en-US"/>
+              </w:rPr>
+              <w:t>ExpectedAmount</w:t>
+            </w:r>
+            <w:r>
+              <w:rPr>
+                <w:rFonts w:ascii="Agency FB" w:hAnsi="Agency FB"/>
+                <w:lang w:val="en-US"/>
+              </w:rPr>
+              <w:t>.Sum</w:t>
+            </w:r>
+          </w:p>
+        </w:tc>
+      </w:tr>
+      <w:tr>
+        <w:tc>
+          <w:tcPr>
+            <w:tcW w:w="1880" w:type="dxa"/>
+            <w:vAlign w:val="center"/>
+          </w:tcPr>
+          <w:p>
+            <w:pPr>
+              <w:pStyle w:val="a7"/>
+              <w:spacing w:line="240" w:lineRule="auto"/>
+              <w:ind w:firstLine="0"/>
+              <w:jc w:val="center"/>
+              <w:rPr>
+                <w:rFonts w:ascii="Agency FB" w:hAnsi="Agency FB"/>
+                <w:lang w:val="en-US"/>
+              </w:rPr>
+            </w:pPr>
+            <w:r>
+              <w:rPr>
+                <w:rFonts w:ascii="Agency FB" w:hAnsi="Agency FB"/>
+                <w:lang w:val="en-US"/>
+              </w:rPr>
+              <w:t>e</w:t>
+            </w:r>
+            <w:r>
+              <w:rPr>
+                <w:rFonts w:ascii="Agency FB" w:hAnsi="Agency FB"/>
+                <w:lang w:val="en-US"/>
+              </w:rPr>
+              <w:t>xpected</w:t>
+            </w:r>
+            <w:r>
+              <w:rPr>
+                <w:rFonts w:ascii="Agency FB" w:hAnsi="Agency FB"/>
+                <w:lang w:val="en-US"/>
+              </w:rPr>
+              <w:t>_currency</w:t>
+            </w:r>
+          </w:p>
+        </w:tc>
+        <w:tc>
+          <w:tcPr>
+            <w:tcW w:w="1393" w:type="dxa"/>
+            <w:vAlign w:val="center"/>
+          </w:tcPr>
+          <w:p>
+            <w:pPr>
+              <w:pStyle w:val="a7"/>
+              <w:spacing w:line="240" w:lineRule="auto"/>
+              <w:ind w:firstLine="0"/>
+              <w:jc w:val="center"/>
+              <w:rPr>
+                <w:rFonts w:ascii="Agency FB" w:hAnsi="Agency FB"/>
+                <w:lang w:val="en-US"/>
+              </w:rPr>
+            </w:pPr>
+            <w:r>
+              <w:rPr>
+                <w:rFonts w:ascii="Agency FB" w:hAnsi="Agency FB"/>
+              </w:rPr>
+              <w:t>varchar(</w:t>
+            </w:r>
+            <w:r>
+              <w:rPr>
+                <w:rFonts w:ascii="Agency FB" w:hAnsi="Agency FB"/>
+                <w:lang w:val="en-US"/>
+              </w:rPr>
+              <w:t>3</w:t>
+            </w:r>
+            <w:r>
+              <w:rPr>
+                <w:rFonts w:ascii="Agency FB" w:hAnsi="Agency FB"/>
+              </w:rPr>
+              <w:t>)</w:t>
+            </w:r>
+          </w:p>
+        </w:tc>
+        <w:tc>
+          <w:tcPr>
+            <w:tcW w:w="1640" w:type="dxa"/>
+            <w:vAlign w:val="center"/>
+          </w:tcPr>
+          <w:p>
+            <w:pPr>
+              <w:pStyle w:val="a7"/>
+              <w:spacing w:line="240" w:lineRule="auto"/>
+              <w:ind w:firstLine="0"/>
+              <w:jc w:val="center"/>
+              <w:rPr>
+                <w:rFonts w:ascii="Agency FB" w:hAnsi="Agency FB"/>
+                <w:lang w:val="en-US"/>
+              </w:rPr>
+            </w:pPr>
+            <w:r>
+              <w:rPr>
+                <w:rFonts w:ascii="Agency FB" w:hAnsi="Agency FB"/>
+              </w:rPr>
+              <w:t>Not Null</w:t>
+            </w:r>
+          </w:p>
+        </w:tc>
+        <w:tc>
+          <w:tcPr>
+            <w:tcW w:w="1603" w:type="dxa"/>
+            <w:vAlign w:val="center"/>
+          </w:tcPr>
+          <w:p>
+            <w:pPr>
+              <w:pStyle w:val="a7"/>
+              <w:spacing w:line="240" w:lineRule="auto"/>
+              <w:ind w:firstLine="0"/>
+              <w:jc w:val="center"/>
+              <w:rPr>
+                <w:rFonts w:ascii="Agency FB" w:hAnsi="Agency FB"/>
+                <w:lang w:val="en-US"/>
+              </w:rPr>
+            </w:pPr>
+            <w:r>
+              <w:rPr>
+                <w:rFonts w:ascii="Agency FB" w:hAnsi="Agency FB"/>
+                <w:lang w:val="en-US"/>
+              </w:rPr>
+              <w:t>OrderPayment</w:t>
+            </w:r>
+          </w:p>
+        </w:tc>
+        <w:tc>
+          <w:tcPr>
+            <w:tcW w:w="2960" w:type="dxa"/>
+            <w:vAlign w:val="center"/>
+          </w:tcPr>
+          <w:p>
+            <w:pPr>
+              <w:pStyle w:val="a7"/>
+              <w:spacing w:line="240" w:lineRule="auto"/>
+              <w:ind w:firstLine="0"/>
+              <w:jc w:val="center"/>
+              <w:rPr>
+                <w:rFonts w:ascii="Agency FB" w:hAnsi="Agency FB"/>
+              </w:rPr>
+            </w:pPr>
+            <w:r>
+              <w:rPr>
+                <w:rFonts w:ascii="Agency FB" w:hAnsi="Agency FB"/>
+                <w:lang w:val="en-US"/>
+              </w:rPr>
+              <w:t>ExpectedAmount</w:t>
+            </w:r>
+            <w:r>
+              <w:rPr>
+                <w:rFonts w:ascii="Agency FB" w:hAnsi="Agency FB"/>
+                <w:lang w:val="en-US"/>
+              </w:rPr>
+              <w:t>.Currency.Code</w:t>
+            </w:r>
+          </w:p>
+        </w:tc>
+      </w:tr>
+      <w:tr>
+        <w:tc>
+          <w:tcPr>
+            <w:tcW w:w="1880" w:type="dxa"/>
+            <w:vAlign w:val="center"/>
+          </w:tcPr>
+          <w:p>
+            <w:pPr>
+              <w:pStyle w:val="a7"/>
+              <w:spacing w:line="240" w:lineRule="auto"/>
+              <w:ind w:firstLine="0"/>
+              <w:jc w:val="center"/>
+              <w:rPr>
+                <w:rFonts w:ascii="Agency FB" w:hAnsi="Agency FB"/>
+                <w:lang w:val="en-US"/>
+              </w:rPr>
+            </w:pPr>
+            <w:r>
+              <w:rPr>
+                <w:rFonts w:ascii="Agency FB" w:hAnsi="Agency FB"/>
+                <w:lang w:val="en-US"/>
+              </w:rPr>
+              <w:t>actual_amount</w:t>
+            </w:r>
+          </w:p>
+        </w:tc>
+        <w:tc>
+          <w:tcPr>
+            <w:tcW w:w="1393" w:type="dxa"/>
+            <w:vAlign w:val="center"/>
+          </w:tcPr>
+          <w:p>
+            <w:pPr>
+              <w:pStyle w:val="a7"/>
+              <w:spacing w:line="240" w:lineRule="auto"/>
+              <w:ind w:firstLine="0"/>
+              <w:jc w:val="center"/>
+              <w:rPr>
+                <w:rFonts w:ascii="Agency FB" w:hAnsi="Agency FB"/>
+                <w:lang w:val="en-US"/>
+              </w:rPr>
+            </w:pPr>
+            <w:r>
+              <w:rPr>
+                <w:rFonts w:ascii="Agency FB" w:hAnsi="Agency FB"/>
+                <w:lang w:val="en-US"/>
+              </w:rPr>
+              <w:t>n</w:t>
+            </w:r>
+            <w:r>
+              <w:rPr>
+                <w:rFonts w:ascii="Agency FB" w:hAnsi="Agency FB"/>
+                <w:lang w:val="en-US"/>
+              </w:rPr>
+              <w:t>umeric(15,2)</w:t>
+            </w:r>
+          </w:p>
+        </w:tc>
+        <w:tc>
+          <w:tcPr>
+            <w:tcW w:w="1640" w:type="dxa"/>
+            <w:vAlign w:val="center"/>
+          </w:tcPr>
+          <w:p>
+            <w:pPr>
+              <w:pStyle w:val="a7"/>
+              <w:spacing w:line="240" w:lineRule="auto"/>
+              <w:ind w:firstLine="0"/>
+              <w:jc w:val="center"/>
+              <w:rPr>
+                <w:rFonts w:ascii="Agency FB" w:hAnsi="Agency FB"/>
+                <w:lang w:val="en-US"/>
+              </w:rPr>
+            </w:pPr>
+            <w:r>
+              <w:rPr>
+                <w:rFonts w:ascii="Agency FB" w:hAnsi="Agency FB"/>
+                <w:lang w:val="en-US"/>
+              </w:rPr>
+              <w:t>C</w:t>
+            </w:r>
+            <w:r>
+              <w:rPr>
+                <w:rFonts w:ascii="Agency FB" w:hAnsi="Agency FB"/>
+                <w:lang w:val="en-US"/>
+              </w:rPr>
+              <w:t>heck</w:t>
+            </w:r>
+            <w:r>
+              <w:rPr>
+                <w:rFonts w:ascii="Agency FB" w:hAnsi="Agency FB"/>
+                <w:lang w:val="en-US"/>
+              </w:rPr>
+              <w:t xml:space="preserve"> (</w:t>
+            </w:r>
+            <w:r>
+              <w:rPr>
+                <w:rFonts w:ascii="Agency FB" w:hAnsi="Agency FB"/>
+                <w:lang w:val="en-US"/>
+              </w:rPr>
+              <w:t>actual_amount</w:t>
+            </w:r>
+            <w:r>
+              <w:rPr>
+                <w:rFonts w:ascii="Agency FB" w:hAnsi="Agency FB"/>
+                <w:lang w:val="en-US"/>
+              </w:rPr>
+              <w:t xml:space="preserve"> &gt;=</w:t>
+            </w:r>
+            <w:r>
+              <w:rPr>
+                <w:rFonts w:ascii="Agency FB" w:hAnsi="Agency FB"/>
+                <w:lang w:val="en-US"/>
+              </w:rPr>
+              <w:t xml:space="preserve"> 0</w:t>
+            </w:r>
+            <w:r>
+              <w:rPr>
+                <w:rFonts w:ascii="Agency FB" w:hAnsi="Agency FB"/>
+                <w:lang w:val="en-US"/>
+              </w:rPr>
+              <w:t>)</w:t>
+            </w:r>
+          </w:p>
+          <w:p>
+            <w:pPr>
+              <w:pStyle w:val="a7"/>
+              <w:spacing w:line="240" w:lineRule="auto"/>
+              <w:ind w:firstLine="0"/>
+              <w:jc w:val="center"/>
+              <w:rPr>
+                <w:rFonts w:ascii="Agency FB" w:hAnsi="Agency FB"/>
+                <w:lang w:val="en-US"/>
+              </w:rPr>
+            </w:pPr>
+            <w:r>
+              <w:rPr>
+                <w:rFonts w:ascii="Agency FB" w:hAnsi="Agency FB"/>
+              </w:rPr>
+              <w:t>Nullable</w:t>
+            </w:r>
+          </w:p>
+        </w:tc>
+        <w:tc>
+          <w:tcPr>
+            <w:tcW w:w="1603" w:type="dxa"/>
+            <w:vAlign w:val="center"/>
+          </w:tcPr>
+          <w:p>
+            <w:pPr>
+              <w:pStyle w:val="a7"/>
+              <w:spacing w:line="240" w:lineRule="auto"/>
+              <w:ind w:firstLine="0"/>
+              <w:jc w:val="center"/>
+              <w:rPr>
+                <w:rFonts w:ascii="Agency FB" w:hAnsi="Agency FB"/>
+                <w:lang w:val="en-US"/>
+              </w:rPr>
+            </w:pPr>
+            <w:r>
+              <w:rPr>
+                <w:rFonts w:ascii="Agency FB" w:hAnsi="Agency FB"/>
+                <w:lang w:val="en-US"/>
+              </w:rPr>
+              <w:t>OrderPayment</w:t>
+            </w:r>
+          </w:p>
+        </w:tc>
+        <w:tc>
+          <w:tcPr>
+            <w:tcW w:w="2960" w:type="dxa"/>
+            <w:vAlign w:val="center"/>
+          </w:tcPr>
+          <w:p>
+            <w:pPr>
+              <w:pStyle w:val="a7"/>
+              <w:spacing w:line="240" w:lineRule="auto"/>
+              <w:ind w:firstLine="0"/>
+              <w:jc w:val="center"/>
+              <w:rPr>
+                <w:rFonts w:ascii="Agency FB" w:hAnsi="Agency FB"/>
+              </w:rPr>
+            </w:pPr>
+            <w:r>
+              <w:rPr>
+                <w:rFonts w:ascii="Agency FB" w:hAnsi="Agency FB"/>
+                <w:lang w:val="en-US"/>
+              </w:rPr>
+              <w:t>ActualAmount</w:t>
+            </w:r>
+            <w:r>
+              <w:rPr>
+                <w:rFonts w:ascii="Agency FB" w:hAnsi="Agency FB"/>
+                <w:lang w:val="en-US"/>
+              </w:rPr>
+              <w:t>.Sum</w:t>
+            </w:r>
+          </w:p>
+        </w:tc>
+      </w:tr>
+      <w:tr>
+        <w:tc>
+          <w:tcPr>
+            <w:tcW w:w="1880" w:type="dxa"/>
+            <w:vAlign w:val="center"/>
+          </w:tcPr>
+          <w:p>
+            <w:pPr>
+              <w:pStyle w:val="a7"/>
+              <w:spacing w:line="240" w:lineRule="auto"/>
+              <w:ind w:firstLine="0"/>
+              <w:jc w:val="center"/>
+              <w:rPr>
+                <w:rFonts w:ascii="Agency FB" w:hAnsi="Agency FB"/>
+                <w:lang w:val="en-US"/>
+              </w:rPr>
+            </w:pPr>
+            <w:r>
+              <w:rPr>
+                <w:rFonts w:ascii="Agency FB" w:hAnsi="Agency FB"/>
+                <w:lang w:val="en-US"/>
+              </w:rPr>
+              <w:t>a</w:t>
+            </w:r>
+            <w:r>
+              <w:rPr>
+                <w:rFonts w:ascii="Agency FB" w:hAnsi="Agency FB"/>
+                <w:lang w:val="en-US"/>
+              </w:rPr>
+              <w:t>ctual</w:t>
+            </w:r>
+            <w:r>
+              <w:rPr>
+                <w:rFonts w:ascii="Agency FB" w:hAnsi="Agency FB"/>
+                <w:lang w:val="en-US"/>
+              </w:rPr>
+              <w:t>_currency</w:t>
+            </w:r>
+          </w:p>
+        </w:tc>
+        <w:tc>
+          <w:tcPr>
+            <w:tcW w:w="1393" w:type="dxa"/>
+            <w:vAlign w:val="center"/>
+          </w:tcPr>
+          <w:p>
+            <w:pPr>
+              <w:pStyle w:val="a7"/>
+              <w:spacing w:line="240" w:lineRule="auto"/>
+              <w:ind w:firstLine="0"/>
+              <w:jc w:val="center"/>
+              <w:rPr>
+                <w:rFonts w:ascii="Agency FB" w:hAnsi="Agency FB"/>
+                <w:lang w:val="en-US"/>
+              </w:rPr>
+            </w:pPr>
+            <w:r>
+              <w:rPr>
+                <w:rFonts w:ascii="Agency FB" w:hAnsi="Agency FB"/>
+              </w:rPr>
+              <w:t>varchar(</w:t>
+            </w:r>
+            <w:r>
+              <w:rPr>
+                <w:rFonts w:ascii="Agency FB" w:hAnsi="Agency FB"/>
+                <w:lang w:val="en-US"/>
+              </w:rPr>
+              <w:t>3</w:t>
+            </w:r>
+            <w:r>
+              <w:rPr>
+                <w:rFonts w:ascii="Agency FB" w:hAnsi="Agency FB"/>
+              </w:rPr>
+              <w:t>)</w:t>
+            </w:r>
+          </w:p>
+        </w:tc>
+        <w:tc>
+          <w:tcPr>
+            <w:tcW w:w="1640" w:type="dxa"/>
+            <w:vAlign w:val="center"/>
+          </w:tcPr>
+          <w:p>
+            <w:pPr>
+              <w:pStyle w:val="a7"/>
+              <w:spacing w:line="240" w:lineRule="auto"/>
+              <w:ind w:firstLine="0"/>
+              <w:jc w:val="center"/>
+              <w:rPr>
+                <w:rFonts w:ascii="Agency FB" w:hAnsi="Agency FB"/>
+                <w:lang w:val="en-US"/>
+              </w:rPr>
+            </w:pPr>
+            <w:r>
+              <w:rPr>
+                <w:rFonts w:ascii="Agency FB" w:hAnsi="Agency FB"/>
+              </w:rPr>
+              <w:t>Nullable</w:t>
+            </w:r>
+          </w:p>
+        </w:tc>
+        <w:tc>
+          <w:tcPr>
+            <w:tcW w:w="1603" w:type="dxa"/>
+            <w:vAlign w:val="center"/>
+          </w:tcPr>
+          <w:p>
+            <w:pPr>
+              <w:pStyle w:val="a7"/>
+              <w:spacing w:line="240" w:lineRule="auto"/>
+              <w:ind w:firstLine="0"/>
+              <w:jc w:val="center"/>
+              <w:rPr>
+                <w:rFonts w:ascii="Agency FB" w:hAnsi="Agency FB"/>
+                <w:lang w:val="en-US"/>
+              </w:rPr>
+            </w:pPr>
+            <w:r>
+              <w:rPr>
+                <w:rFonts w:ascii="Agency FB" w:hAnsi="Agency FB"/>
+                <w:lang w:val="en-US"/>
+              </w:rPr>
+              <w:t>OrderPayment</w:t>
+            </w:r>
+          </w:p>
+        </w:tc>
+        <w:tc>
+          <w:tcPr>
+            <w:tcW w:w="2960" w:type="dxa"/>
+            <w:vAlign w:val="center"/>
+          </w:tcPr>
+          <w:p>
+            <w:pPr>
+              <w:pStyle w:val="a7"/>
+              <w:spacing w:line="240" w:lineRule="auto"/>
+              <w:ind w:firstLine="0"/>
+              <w:jc w:val="center"/>
+              <w:rPr>
+                <w:rFonts w:ascii="Agency FB" w:hAnsi="Agency FB"/>
+              </w:rPr>
+            </w:pPr>
+            <w:r>
+              <w:rPr>
+                <w:rFonts w:ascii="Agency FB" w:hAnsi="Agency FB"/>
+                <w:lang w:val="en-US"/>
+              </w:rPr>
+              <w:t>ActualAmount</w:t>
+            </w:r>
+            <w:r>
+              <w:rPr>
+                <w:rFonts w:ascii="Agency FB" w:hAnsi="Agency FB"/>
+                <w:lang w:val="en-US"/>
+              </w:rPr>
+              <w:t>.Currency.Code</w:t>
+            </w:r>
           </w:p>
         </w:tc>
       </w:tr>
@@ -1424,25 +2019,21 @@
       <w:pPr>
         <w:pStyle w:val="a7"/>
       </w:pPr>
-      <w:proofErr w:type="spellStart"/>
       <w:r>
         <w:rPr>
           <w:lang w:val="en-US"/>
         </w:rPr>
         <w:t>PaymentStatus</w:t>
       </w:r>
-      <w:proofErr w:type="spellEnd"/>
       <w:r>
         <w:t xml:space="preserve"> </w:t>
       </w:r>
-      <w:proofErr w:type="spellStart"/>
       <w:r>
         <w:rPr>
           <w:lang w:val="en-US"/>
         </w:rPr>
         <w:t>enum</w:t>
       </w:r>
-      <w:proofErr w:type="spellEnd"/>
       <w:r>
         <w:t xml:space="preserve"> </w:t>
       </w:r>
@@ -1542,14 +2133,13 @@
           <w:lang w:val="en-US"/>
         </w:rPr>
       </w:pPr>
-      <w:proofErr w:type="spellStart"/>
       <w:r>
         <w:rPr>
           <w:lang w:val="en-US"/>
         </w:rPr>
+        <w:lastRenderedPageBreak/>
         <w:t>RefundRequested</w:t>
       </w:r>
-      <w:proofErr w:type="spellEnd"/>
     </w:p>
     <w:p>
       <w:pPr>
@@ -1574,14 +2164,12 @@
         <w:lastRenderedPageBreak/>
         <w:t xml:space="preserve">Сущность </w:t>
       </w:r>
-      <w:proofErr w:type="spellStart"/>
       <w:r>
         <w:rPr>
           <w:lang w:val="en-US"/>
         </w:rPr>
         <w:t>Exrternal</w:t>
       </w:r>
-      <w:proofErr w:type="spellEnd"/>
       <w:r>
         <w:t>_</w:t>
       </w:r>
@@ -1623,14 +2211,12 @@
       <w:r>
         <w:t xml:space="preserve">таблицы </w:t>
       </w:r>
-      <w:proofErr w:type="spellStart"/>
       <w:r>
         <w:rPr>
           <w:lang w:val="en-US"/>
         </w:rPr>
         <w:t>Exrternal</w:t>
       </w:r>
-      <w:proofErr w:type="spellEnd"/>
       <w:r>
         <w:t>_</w:t>
       </w:r>
@@ -1915,7 +2501,6 @@
                 <w:lang w:val="en-US"/>
               </w:rPr>
             </w:pPr>
-            <w:proofErr w:type="spellStart"/>
             <w:r>
               <w:rPr>
                 <w:rFonts w:ascii="Agency FB" w:hAnsi="Agency FB" w:cs="Calibri"/>
@@ -1930,7 +2515,6 @@
               </w:rPr>
               <w:t>id</w:t>
             </w:r>
-            <w:proofErr w:type="spellEnd"/>
           </w:p>
         </w:tc>
         <w:tc>
@@ -1948,7 +2532,6 @@
                 <w:lang w:val="en-US"/>
               </w:rPr>
             </w:pPr>
-            <w:proofErr w:type="spellStart"/>
             <w:r>
               <w:rPr>
                 <w:rFonts w:ascii="Agency FB" w:hAnsi="Agency FB"/>
@@ -1963,7 +2546,6 @@
               </w:rPr>
               <w:t>uid</w:t>
             </w:r>
-            <w:proofErr w:type="spellEnd"/>
           </w:p>
         </w:tc>
         <w:tc>
@@ -2013,7 +2595,6 @@
                 <w:iCs/>
               </w:rPr>
             </w:pPr>
-            <w:proofErr w:type="spellStart"/>
             <w:r>
               <w:rPr>
                 <w:rFonts w:ascii="Agency FB" w:hAnsi="Agency FB"/>
@@ -2021,7 +2602,6 @@
               </w:rPr>
               <w:t>OrderPayment</w:t>
             </w:r>
-            <w:proofErr w:type="spellEnd"/>
           </w:p>
         </w:tc>
         <w:tc>
@@ -2065,7 +2645,6 @@
                 <w:lang w:val="en-US"/>
               </w:rPr>
             </w:pPr>
-            <w:proofErr w:type="spellStart"/>
             <w:r>
               <w:rPr>
                 <w:rFonts w:ascii="Agency FB" w:hAnsi="Agency FB"/>
@@ -2073,7 +2652,6 @@
               </w:rPr>
               <w:t>external_id</w:t>
             </w:r>
-            <w:proofErr w:type="spellEnd"/>
           </w:p>
         </w:tc>
         <w:tc>
@@ -2092,19 +2670,11 @@
                 <w:lang w:val="en-US"/>
               </w:rPr>
             </w:pPr>
-            <w:proofErr w:type="spellStart"/>
-            <w:r>
-              <w:rPr>
-                <w:rFonts w:ascii="Agency FB" w:hAnsi="Agency FB"/>
-              </w:rPr>
-              <w:t>varchar</w:t>
-            </w:r>
-            <w:proofErr w:type="spellEnd"/>
-            <w:r>
-              <w:rPr>
-                <w:rFonts w:ascii="Agency FB" w:hAnsi="Agency FB"/>
-              </w:rPr>
-              <w:t>(255)</w:t>
+            <w:r>
+              <w:rPr>
+                <w:rFonts w:ascii="Agency FB" w:hAnsi="Agency FB"/>
+              </w:rPr>
+              <w:t>varchar(255)</w:t>
             </w:r>
           </w:p>
         </w:tc>
@@ -2124,28 +2694,12 @@
                 <w:lang w:val="en-US"/>
               </w:rPr>
             </w:pPr>
-            <w:proofErr w:type="spellStart"/>
-            <w:r>
-              <w:rPr>
-                <w:rFonts w:ascii="Agency FB" w:hAnsi="Agency FB"/>
-              </w:rPr>
-              <w:t>Not</w:t>
-            </w:r>
-            <w:proofErr w:type="spellEnd"/>
-            <w:r>
-              <w:rPr>
-                <w:rFonts w:ascii="Agency FB" w:hAnsi="Agency FB"/>
-              </w:rPr>
-              <w:t xml:space="preserve"> </w:t>
-            </w:r>
-            <w:proofErr w:type="spellStart"/>
-            <w:r>
-              <w:rPr>
-                <w:rFonts w:ascii="Agency FB" w:hAnsi="Agency FB"/>
-              </w:rPr>
-              <w:t>Null</w:t>
-            </w:r>
-            <w:proofErr w:type="spellEnd"/>
+            <w:r>
+              <w:rPr>
+                <w:rFonts w:ascii="Agency FB" w:hAnsi="Agency FB"/>
+              </w:rPr>
+              <w:t>Not Null</w:t>
+            </w:r>
           </w:p>
         </w:tc>
         <w:tc>
@@ -2164,7 +2718,6 @@
                 <w:lang w:val="en-US"/>
               </w:rPr>
             </w:pPr>
-            <w:proofErr w:type="spellStart"/>
             <w:r>
               <w:rPr>
                 <w:rFonts w:ascii="Agency FB" w:hAnsi="Agency FB"/>
@@ -2172,7 +2725,6 @@
               </w:rPr>
               <w:t>ExternalSession</w:t>
             </w:r>
-            <w:proofErr w:type="spellEnd"/>
           </w:p>
         </w:tc>
         <w:tc>
@@ -2191,14 +2743,12 @@
                 <w:lang w:val="en-US"/>
               </w:rPr>
             </w:pPr>
-            <w:proofErr w:type="spellStart"/>
             <w:r>
               <w:rPr>
                 <w:rFonts w:ascii="Agency FB" w:hAnsi="Agency FB"/>
               </w:rPr>
               <w:t>ExternalId</w:t>
             </w:r>
-            <w:proofErr w:type="spellEnd"/>
           </w:p>
         </w:tc>
       </w:tr>
@@ -2219,7 +2769,6 @@
                 <w:lang w:val="en-US"/>
               </w:rPr>
             </w:pPr>
-            <w:proofErr w:type="spellStart"/>
             <w:r>
               <w:rPr>
                 <w:rFonts w:ascii="Agency FB" w:hAnsi="Agency FB"/>
@@ -2227,7 +2776,6 @@
               </w:rPr>
               <w:t>checkout_url</w:t>
             </w:r>
-            <w:proofErr w:type="spellEnd"/>
           </w:p>
         </w:tc>
         <w:tc>
@@ -2270,28 +2818,12 @@
                 <w:rFonts w:ascii="Agency FB" w:hAnsi="Agency FB"/>
               </w:rPr>
             </w:pPr>
-            <w:proofErr w:type="spellStart"/>
-            <w:r>
-              <w:rPr>
-                <w:rFonts w:ascii="Agency FB" w:hAnsi="Agency FB"/>
-              </w:rPr>
-              <w:t>Not</w:t>
-            </w:r>
-            <w:proofErr w:type="spellEnd"/>
-            <w:r>
-              <w:rPr>
-                <w:rFonts w:ascii="Agency FB" w:hAnsi="Agency FB"/>
-              </w:rPr>
-              <w:t xml:space="preserve"> </w:t>
-            </w:r>
-            <w:proofErr w:type="spellStart"/>
-            <w:r>
-              <w:rPr>
-                <w:rFonts w:ascii="Agency FB" w:hAnsi="Agency FB"/>
-              </w:rPr>
-              <w:t>Null</w:t>
-            </w:r>
-            <w:proofErr w:type="spellEnd"/>
+            <w:r>
+              <w:rPr>
+                <w:rFonts w:ascii="Agency FB" w:hAnsi="Agency FB"/>
+              </w:rPr>
+              <w:t>Not Null</w:t>
+            </w:r>
           </w:p>
         </w:tc>
         <w:tc>
@@ -2309,7 +2841,6 @@
                 <w:rFonts w:ascii="Agency FB" w:hAnsi="Agency FB"/>
               </w:rPr>
             </w:pPr>
-            <w:proofErr w:type="spellStart"/>
             <w:r>
               <w:rPr>
                 <w:rFonts w:ascii="Agency FB" w:hAnsi="Agency FB"/>
@@ -2317,7 +2848,6 @@
               </w:rPr>
               <w:t>ExternalSession</w:t>
             </w:r>
-            <w:proofErr w:type="spellEnd"/>
           </w:p>
         </w:tc>
         <w:tc>
@@ -2335,14 +2865,12 @@
                 <w:rFonts w:ascii="Agency FB" w:hAnsi="Agency FB"/>
               </w:rPr>
             </w:pPr>
-            <w:proofErr w:type="spellStart"/>
             <w:r>
               <w:rPr>
                 <w:rFonts w:ascii="Agency FB" w:hAnsi="Agency FB"/>
               </w:rPr>
               <w:t>CheckoutUrl</w:t>
             </w:r>
-            <w:proofErr w:type="spellEnd"/>
           </w:p>
         </w:tc>
       </w:tr>
@@ -2363,7 +2891,6 @@
                 <w:lang w:val="en-US"/>
               </w:rPr>
             </w:pPr>
-            <w:proofErr w:type="spellStart"/>
             <w:r>
               <w:rPr>
                 <w:rFonts w:ascii="Agency FB" w:hAnsi="Agency FB"/>
@@ -2371,7 +2898,6 @@
               </w:rPr>
               <w:t>expires_at_utc</w:t>
             </w:r>
-            <w:proofErr w:type="spellEnd"/>
           </w:p>
         </w:tc>
         <w:tc>
@@ -2389,14 +2915,12 @@
                 <w:rFonts w:ascii="Agency FB" w:hAnsi="Agency FB"/>
               </w:rPr>
             </w:pPr>
-            <w:proofErr w:type="spellStart"/>
             <w:r>
               <w:rPr>
                 <w:rFonts w:ascii="Agency FB" w:hAnsi="Agency FB"/>
               </w:rPr>
               <w:t>timestamptz</w:t>
             </w:r>
-            <w:proofErr w:type="spellEnd"/>
           </w:p>
         </w:tc>
         <w:tc>
@@ -2415,28 +2939,12 @@
                 <w:lang w:val="en-US"/>
               </w:rPr>
             </w:pPr>
-            <w:proofErr w:type="spellStart"/>
-            <w:r>
-              <w:rPr>
-                <w:rFonts w:ascii="Agency FB" w:hAnsi="Agency FB"/>
-              </w:rPr>
-              <w:t>Not</w:t>
-            </w:r>
-            <w:proofErr w:type="spellEnd"/>
-            <w:r>
-              <w:rPr>
-                <w:rFonts w:ascii="Agency FB" w:hAnsi="Agency FB"/>
-              </w:rPr>
-              <w:t xml:space="preserve"> </w:t>
-            </w:r>
-            <w:proofErr w:type="spellStart"/>
-            <w:r>
-              <w:rPr>
-                <w:rFonts w:ascii="Agency FB" w:hAnsi="Agency FB"/>
-              </w:rPr>
-              <w:t>Null</w:t>
-            </w:r>
-            <w:proofErr w:type="spellEnd"/>
+            <w:r>
+              <w:rPr>
+                <w:rFonts w:ascii="Agency FB" w:hAnsi="Agency FB"/>
+              </w:rPr>
+              <w:t>Not Null</w:t>
+            </w:r>
           </w:p>
         </w:tc>
         <w:tc>
@@ -2454,7 +2962,6 @@
                 <w:rFonts w:ascii="Agency FB" w:hAnsi="Agency FB"/>
               </w:rPr>
             </w:pPr>
-            <w:proofErr w:type="spellStart"/>
             <w:r>
               <w:rPr>
                 <w:rFonts w:ascii="Agency FB" w:hAnsi="Agency FB"/>
@@ -2462,7 +2969,6 @@
               </w:rPr>
               <w:t>ExternalSession</w:t>
             </w:r>
-            <w:proofErr w:type="spellEnd"/>
           </w:p>
         </w:tc>
         <w:tc>
@@ -2480,14 +2986,12 @@
                 <w:rFonts w:ascii="Agency FB" w:hAnsi="Agency FB"/>
               </w:rPr>
             </w:pPr>
-            <w:proofErr w:type="spellStart"/>
             <w:r>
               <w:rPr>
                 <w:rFonts w:ascii="Agency FB" w:hAnsi="Agency FB"/>
               </w:rPr>
               <w:t>ExpiresAtUtc</w:t>
             </w:r>
-            <w:proofErr w:type="spellEnd"/>
           </w:p>
         </w:tc>
       </w:tr>
@@ -2512,7 +3016,7 @@
 </file>
 
 <file path=word/endnotes.xml><?xml version="1.0" encoding="utf-8"?>
-<w:endnotes xmlns:wpc="http://schemas.microsoft.com/office/word/2010/wordprocessingCanvas" xmlns:cx="http://schemas.microsoft.com/office/drawing/2014/chartex" xmlns:cx1="http://schemas.microsoft.com/office/drawing/2015/9/8/chartex" xmlns:cx2="http://schemas.microsoft.com/office/drawing/2015/10/21/chartex" xmlns:cx3="http://schemas.microsoft.com/office/drawing/2016/5/9/chartex" xmlns:cx4="http://schemas.microsoft.com/office/drawing/2016/5/10/chartex" xmlns:cx5="http://schemas.microsoft.com/office/drawing/2016/5/11/chartex" xmlns:cx6="http://schemas.microsoft.com/office/drawing/2016/5/12/chartex" xmlns:cx7="http://schemas.microsoft.com/office/drawing/2016/5/13/chartex" xmlns:cx8="http://schemas.microsoft.com/office/drawing/2016/5/14/chartex" xmlns:mc="http://schemas.openxmlformats.org/markup-compatibility/2006" xmlns:aink="http://schemas.microsoft.com/office/drawing/2016/ink" xmlns:am3d="http://schemas.microsoft.com/office/drawing/2017/model3d" xmlns:o="urn:schemas-microsoft-com:office:office" xmlns:oel="http://schemas.microsoft.com/office/2019/extlst" xmlns:r="http://schemas.openxmlformats.org/officeDocument/2006/relationships" xmlns:m="http://schemas.openxmlformats.org/officeDocument/2006/math" xmlns:v="urn:schemas-microsoft-com:vml" xmlns:wp14="http://schemas.microsoft.com/office/word/2010/wordprocessingDrawing" xmlns:wp="http://schemas.openxmlformats.org/drawingml/2006/wordprocessingDrawing" xmlns:w10="urn:schemas-microsoft-com:office:word" xmlns:w="http://schemas.openxmlformats.org/wordprocessingml/2006/main" xmlns:w14="http://schemas.microsoft.com/office/word/2010/wordml" xmlns:w15="http://schemas.microsoft.com/office/word/2012/wordml" xmlns:w16cex="http://schemas.microsoft.com/office/word/2018/wordml/cex" xmlns:w16cid="http://schemas.microsoft.com/office/word/2016/wordml/cid" xmlns:w16="http://schemas.microsoft.com/office/word/2018/wordml" xmlns:w16du="http://schemas.microsoft.com/office/word/2023/wordml/word16du" xmlns:w16sdtdh="http://schemas.microsoft.com/office/word/2020/wordml/sdtdatahash" xmlns:w16sdtfl="http://schemas.microsoft.com/office/word/2024/wordml/sdtformatlock" xmlns:w16se="http://schemas.microsoft.com/office/word/2015/wordml/symex" xmlns:wpg="http://schemas.microsoft.com/office/word/2010/wordprocessingGroup" xmlns:wpi="http://schemas.microsoft.com/office/word/2010/wordprocessingInk" xmlns:wne="http://schemas.microsoft.com/office/word/2006/wordml" xmlns:wps="http://schemas.microsoft.com/office/word/2010/wordprocessingShape" mc:Ignorable="w14 w15 w16se w16cid w16 w16cex w16sdtdh w16sdtfl w16du wp14">
+<w:endnotes xmlns:wpc="http://schemas.microsoft.com/office/word/2010/wordprocessingCanvas" xmlns:cx="http://schemas.microsoft.com/office/drawing/2014/chartex" xmlns:cx1="http://schemas.microsoft.com/office/drawing/2015/9/8/chartex" xmlns:cx2="http://schemas.microsoft.com/office/drawing/2015/10/21/chartex" xmlns:cx3="http://schemas.microsoft.com/office/drawing/2016/5/9/chartex" xmlns:cx4="http://schemas.microsoft.com/office/drawing/2016/5/10/chartex" xmlns:cx5="http://schemas.microsoft.com/office/drawing/2016/5/11/chartex" xmlns:cx6="http://schemas.microsoft.com/office/drawing/2016/5/12/chartex" xmlns:cx7="http://schemas.microsoft.com/office/drawing/2016/5/13/chartex" xmlns:cx8="http://schemas.microsoft.com/office/drawing/2016/5/14/chartex" xmlns:mc="http://schemas.openxmlformats.org/markup-compatibility/2006" xmlns:aink="http://schemas.microsoft.com/office/drawing/2016/ink" xmlns:am3d="http://schemas.microsoft.com/office/drawing/2017/model3d" xmlns:o="urn:schemas-microsoft-com:office:office" xmlns:oel="http://schemas.microsoft.com/office/2019/extlst" xmlns:r="http://schemas.openxmlformats.org/officeDocument/2006/relationships" xmlns:m="http://schemas.openxmlformats.org/officeDocument/2006/math" xmlns:v="urn:schemas-microsoft-com:vml" xmlns:wp14="http://schemas.microsoft.com/office/word/2010/wordprocessingDrawing" xmlns:wp="http://schemas.openxmlformats.org/drawingml/2006/wordprocessingDrawing" xmlns:w10="urn:schemas-microsoft-com:office:word" xmlns:w="http://schemas.openxmlformats.org/wordprocessingml/2006/main" xmlns:w14="http://schemas.microsoft.com/office/word/2010/wordml" xmlns:w15="http://schemas.microsoft.com/office/word/2012/wordml" xmlns:w16cei="http://schemas.microsoft.com/office/word/2026/wordml/cei" xmlns:w16cex="http://schemas.microsoft.com/office/word/2018/wordml/cex" xmlns:w16cid="http://schemas.microsoft.com/office/word/2016/wordml/cid" xmlns:w16="http://schemas.microsoft.com/office/word/2018/wordml" xmlns:w16du="http://schemas.microsoft.com/office/word/2023/wordml/word16du" xmlns:w16sdtdh="http://schemas.microsoft.com/office/word/2020/wordml/sdtdatahash" xmlns:w16sdtfl="http://schemas.microsoft.com/office/word/2024/wordml/sdtformatlock" xmlns:w16se="http://schemas.microsoft.com/office/word/2015/wordml/symex" xmlns:wpg="http://schemas.microsoft.com/office/word/2010/wordprocessingGroup" xmlns:wpi="http://schemas.microsoft.com/office/word/2010/wordprocessingInk" xmlns:wne="http://schemas.microsoft.com/office/word/2006/wordml" xmlns:wps="http://schemas.microsoft.com/office/word/2010/wordprocessingShape" mc:Ignorable="w14 w15 w16se w16cid w16 w16cex w16sdtdh w16sdtfl w16du wp14">
   <w:endnote w:type="separator" w:id="-1">
     <w:p>
       <w:pPr>
@@ -2537,7 +3041,7 @@
 </file>
 
 <file path=word/footnotes.xml><?xml version="1.0" encoding="utf-8"?>
-<w:footnotes xmlns:wpc="http://schemas.microsoft.com/office/word/2010/wordprocessingCanvas" xmlns:cx="http://schemas.microsoft.com/office/drawing/2014/chartex" xmlns:cx1="http://schemas.microsoft.com/office/drawing/2015/9/8/chartex" xmlns:cx2="http://schemas.microsoft.com/office/drawing/2015/10/21/chartex" xmlns:cx3="http://schemas.microsoft.com/office/drawing/2016/5/9/chartex" xmlns:cx4="http://schemas.microsoft.com/office/drawing/2016/5/10/chartex" xmlns:cx5="http://schemas.microsoft.com/office/drawing/2016/5/11/chartex" xmlns:cx6="http://schemas.microsoft.com/office/drawing/2016/5/12/chartex" xmlns:cx7="http://schemas.microsoft.com/office/drawing/2016/5/13/chartex" xmlns:cx8="http://schemas.microsoft.com/office/drawing/2016/5/14/chartex" xmlns:mc="http://schemas.openxmlformats.org/markup-compatibility/2006" xmlns:aink="http://schemas.microsoft.com/office/drawing/2016/ink" xmlns:am3d="http://schemas.microsoft.com/office/drawing/2017/model3d" xmlns:o="urn:schemas-microsoft-com:office:office" xmlns:oel="http://schemas.microsoft.com/office/2019/extlst" xmlns:r="http://schemas.openxmlformats.org/officeDocument/2006/relationships" xmlns:m="http://schemas.openxmlformats.org/officeDocument/2006/math" xmlns:v="urn:schemas-microsoft-com:vml" xmlns:wp14="http://schemas.microsoft.com/office/word/2010/wordprocessingDrawing" xmlns:wp="http://schemas.openxmlformats.org/drawingml/2006/wordprocessingDrawing" xmlns:w10="urn:schemas-microsoft-com:office:word" xmlns:w="http://schemas.openxmlformats.org/wordprocessingml/2006/main" xmlns:w14="http://schemas.microsoft.com/office/word/2010/wordml" xmlns:w15="http://schemas.microsoft.com/office/word/2012/wordml" xmlns:w16cex="http://schemas.microsoft.com/office/word/2018/wordml/cex" xmlns:w16cid="http://schemas.microsoft.com/office/word/2016/wordml/cid" xmlns:w16="http://schemas.microsoft.com/office/word/2018/wordml" xmlns:w16du="http://schemas.microsoft.com/office/word/2023/wordml/word16du" xmlns:w16sdtdh="http://schemas.microsoft.com/office/word/2020/wordml/sdtdatahash" xmlns:w16sdtfl="http://schemas.microsoft.com/office/word/2024/wordml/sdtformatlock" xmlns:w16se="http://schemas.microsoft.com/office/word/2015/wordml/symex" xmlns:wpg="http://schemas.microsoft.com/office/word/2010/wordprocessingGroup" xmlns:wpi="http://schemas.microsoft.com/office/word/2010/wordprocessingInk" xmlns:wne="http://schemas.microsoft.com/office/word/2006/wordml" xmlns:wps="http://schemas.microsoft.com/office/word/2010/wordprocessingShape" mc:Ignorable="w14 w15 w16se w16cid w16 w16cex w16sdtdh w16sdtfl w16du wp14">
+<w:footnotes xmlns:wpc="http://schemas.microsoft.com/office/word/2010/wordprocessingCanvas" xmlns:cx="http://schemas.microsoft.com/office/drawing/2014/chartex" xmlns:cx1="http://schemas.microsoft.com/office/drawing/2015/9/8/chartex" xmlns:cx2="http://schemas.microsoft.com/office/drawing/2015/10/21/chartex" xmlns:cx3="http://schemas.microsoft.com/office/drawing/2016/5/9/chartex" xmlns:cx4="http://schemas.microsoft.com/office/drawing/2016/5/10/chartex" xmlns:cx5="http://schemas.microsoft.com/office/drawing/2016/5/11/chartex" xmlns:cx6="http://schemas.microsoft.com/office/drawing/2016/5/12/chartex" xmlns:cx7="http://schemas.microsoft.com/office/drawing/2016/5/13/chartex" xmlns:cx8="http://schemas.microsoft.com/office/drawing/2016/5/14/chartex" xmlns:mc="http://schemas.openxmlformats.org/markup-compatibility/2006" xmlns:aink="http://schemas.microsoft.com/office/drawing/2016/ink" xmlns:am3d="http://schemas.microsoft.com/office/drawing/2017/model3d" xmlns:o="urn:schemas-microsoft-com:office:office" xmlns:oel="http://schemas.microsoft.com/office/2019/extlst" xmlns:r="http://schemas.openxmlformats.org/officeDocument/2006/relationships" xmlns:m="http://schemas.openxmlformats.org/officeDocument/2006/math" xmlns:v="urn:schemas-microsoft-com:vml" xmlns:wp14="http://schemas.microsoft.com/office/word/2010/wordprocessingDrawing" xmlns:wp="http://schemas.openxmlformats.org/drawingml/2006/wordprocessingDrawing" xmlns:w10="urn:schemas-microsoft-com:office:word" xmlns:w="http://schemas.openxmlformats.org/wordprocessingml/2006/main" xmlns:w14="http://schemas.microsoft.com/office/word/2010/wordml" xmlns:w15="http://schemas.microsoft.com/office/word/2012/wordml" xmlns:w16cei="http://schemas.microsoft.com/office/word/2026/wordml/cei" xmlns:w16cex="http://schemas.microsoft.com/office/word/2018/wordml/cex" xmlns:w16cid="http://schemas.microsoft.com/office/word/2016/wordml/cid" xmlns:w16="http://schemas.microsoft.com/office/word/2018/wordml" xmlns:w16du="http://schemas.microsoft.com/office/word/2023/wordml/word16du" xmlns:w16sdtdh="http://schemas.microsoft.com/office/word/2020/wordml/sdtdatahash" xmlns:w16sdtfl="http://schemas.microsoft.com/office/word/2024/wordml/sdtformatlock" xmlns:w16se="http://schemas.microsoft.com/office/word/2015/wordml/symex" xmlns:wpg="http://schemas.microsoft.com/office/word/2010/wordprocessingGroup" xmlns:wpi="http://schemas.microsoft.com/office/word/2010/wordprocessingInk" xmlns:wne="http://schemas.microsoft.com/office/word/2006/wordml" xmlns:wps="http://schemas.microsoft.com/office/word/2010/wordprocessingShape" mc:Ignorable="w14 w15 w16se w16cid w16 w16cex w16sdtdh w16sdtfl w16du wp14">
   <w:footnote w:type="separator" w:id="-1">
     <w:p>
       <w:pPr>
@@ -2562,7 +3066,7 @@
 </file>
 
 <file path=word/numbering.xml><?xml version="1.0" encoding="utf-8"?>
-<w:numbering xmlns:wpc="http://schemas.microsoft.com/office/word/2010/wordprocessingCanvas" xmlns:cx="http://schemas.microsoft.com/office/drawing/2014/chartex" xmlns:cx1="http://schemas.microsoft.com/office/drawing/2015/9/8/chartex" xmlns:cx2="http://schemas.microsoft.com/office/drawing/2015/10/21/chartex" xmlns:cx3="http://schemas.microsoft.com/office/drawing/2016/5/9/chartex" xmlns:cx4="http://schemas.microsoft.com/office/drawing/2016/5/10/chartex" xmlns:cx5="http://schemas.microsoft.com/office/drawing/2016/5/11/chartex" xmlns:cx6="http://schemas.microsoft.com/office/drawing/2016/5/12/chartex" xmlns:cx7="http://schemas.microsoft.com/office/drawing/2016/5/13/chartex" xmlns:cx8="http://schemas.microsoft.com/office/drawing/2016/5/14/chartex" xmlns:mc="http://schemas.openxmlformats.org/markup-compatibility/2006" xmlns:aink="http://schemas.microsoft.com/office/drawing/2016/ink" xmlns:am3d="http://schemas.microsoft.com/office/drawing/2017/model3d" xmlns:o="urn:schemas-microsoft-com:office:office" xmlns:oel="http://schemas.microsoft.com/office/2019/extlst" xmlns:r="http://schemas.openxmlformats.org/officeDocument/2006/relationships" xmlns:m="http://schemas.openxmlformats.org/officeDocument/2006/math" xmlns:v="urn:schemas-microsoft-com:vml" xmlns:wp14="http://schemas.microsoft.com/office/word/2010/wordprocessingDrawing" xmlns:wp="http://schemas.openxmlformats.org/drawingml/2006/wordprocessingDrawing" xmlns:w10="urn:schemas-microsoft-com:office:word" xmlns:w="http://schemas.openxmlformats.org/wordprocessingml/2006/main" xmlns:w14="http://schemas.microsoft.com/office/word/2010/wordml" xmlns:w15="http://schemas.microsoft.com/office/word/2012/wordml" xmlns:w16cex="http://schemas.microsoft.com/office/word/2018/wordml/cex" xmlns:w16cid="http://schemas.microsoft.com/office/word/2016/wordml/cid" xmlns:w16="http://schemas.microsoft.com/office/word/2018/wordml" xmlns:w16du="http://schemas.microsoft.com/office/word/2023/wordml/word16du" xmlns:w16sdtdh="http://schemas.microsoft.com/office/word/2020/wordml/sdtdatahash" xmlns:w16sdtfl="http://schemas.microsoft.com/office/word/2024/wordml/sdtformatlock" xmlns:w16se="http://schemas.microsoft.com/office/word/2015/wordml/symex" xmlns:wpg="http://schemas.microsoft.com/office/word/2010/wordprocessingGroup" xmlns:wpi="http://schemas.microsoft.com/office/word/2010/wordprocessingInk" xmlns:wne="http://schemas.microsoft.com/office/word/2006/wordml" xmlns:wps="http://schemas.microsoft.com/office/word/2010/wordprocessingShape" mc:Ignorable="w14 w15 w16se w16cid w16 w16cex w16sdtdh w16sdtfl w16du wp14">
+<w:numbering xmlns:wpc="http://schemas.microsoft.com/office/word/2010/wordprocessingCanvas" xmlns:cx="http://schemas.microsoft.com/office/drawing/2014/chartex" xmlns:cx1="http://schemas.microsoft.com/office/drawing/2015/9/8/chartex" xmlns:cx2="http://schemas.microsoft.com/office/drawing/2015/10/21/chartex" xmlns:cx3="http://schemas.microsoft.com/office/drawing/2016/5/9/chartex" xmlns:cx4="http://schemas.microsoft.com/office/drawing/2016/5/10/chartex" xmlns:cx5="http://schemas.microsoft.com/office/drawing/2016/5/11/chartex" xmlns:cx6="http://schemas.microsoft.com/office/drawing/2016/5/12/chartex" xmlns:cx7="http://schemas.microsoft.com/office/drawing/2016/5/13/chartex" xmlns:cx8="http://schemas.microsoft.com/office/drawing/2016/5/14/chartex" xmlns:mc="http://schemas.openxmlformats.org/markup-compatibility/2006" xmlns:aink="http://schemas.microsoft.com/office/drawing/2016/ink" xmlns:am3d="http://schemas.microsoft.com/office/drawing/2017/model3d" xmlns:o="urn:schemas-microsoft-com:office:office" xmlns:oel="http://schemas.microsoft.com/office/2019/extlst" xmlns:r="http://schemas.openxmlformats.org/officeDocument/2006/relationships" xmlns:m="http://schemas.openxmlformats.org/officeDocument/2006/math" xmlns:v="urn:schemas-microsoft-com:vml" xmlns:wp14="http://schemas.microsoft.com/office/word/2010/wordprocessingDrawing" xmlns:wp="http://schemas.openxmlformats.org/drawingml/2006/wordprocessingDrawing" xmlns:w10="urn:schemas-microsoft-com:office:word" xmlns:w="http://schemas.openxmlformats.org/wordprocessingml/2006/main" xmlns:w14="http://schemas.microsoft.com/office/word/2010/wordml" xmlns:w15="http://schemas.microsoft.com/office/word/2012/wordml" xmlns:w16cei="http://schemas.microsoft.com/office/word/2026/wordml/cei" xmlns:w16cex="http://schemas.microsoft.com/office/word/2018/wordml/cex" xmlns:w16cid="http://schemas.microsoft.com/office/word/2016/wordml/cid" xmlns:w16="http://schemas.microsoft.com/office/word/2018/wordml" xmlns:w16du="http://schemas.microsoft.com/office/word/2023/wordml/word16du" xmlns:w16sdtdh="http://schemas.microsoft.com/office/word/2020/wordml/sdtdatahash" xmlns:w16sdtfl="http://schemas.microsoft.com/office/word/2024/wordml/sdtformatlock" xmlns:w16se="http://schemas.microsoft.com/office/word/2015/wordml/symex" xmlns:wpg="http://schemas.microsoft.com/office/word/2010/wordprocessingGroup" xmlns:wpi="http://schemas.microsoft.com/office/word/2010/wordprocessingInk" xmlns:wne="http://schemas.microsoft.com/office/word/2006/wordml" xmlns:wps="http://schemas.microsoft.com/office/word/2010/wordprocessingShape" mc:Ignorable="w14 w15 w16se w16cid w16 w16cex w16sdtdh w16sdtfl w16du wp14">
   <w:abstractNum w:abstractNumId="0" w15:restartNumberingAfterBreak="0">
     <w:nsid w:val="4AB66614"/>
     <w:multiLevelType w:val="hybridMultilevel"/>
@@ -3262,7 +3766,6 @@
   <w:style w:type="character" w:default="1" w:styleId="a0">
     <w:name w:val="Default Paragraph Font"/>
     <w:uiPriority w:val="1"/>
-    <w:semiHidden/>
     <w:unhideWhenUsed/>
   </w:style>
   <w:style w:type="table" w:default="1" w:styleId="a1">

</xml_diff>